<commit_message>
Add real DeepSeek experiment and audited lab04 report
</commit_message>
<xml_diff>
--- a/lab04/report/2024311281_孙驰_实验作业四.docx
+++ b/lab04/report/2024311281_孙驰_实验作业四.docx
@@ -251,6 +251,21 @@
     </w:p>
     <w:p>
       <w:pPr>
+        <w:keepLines/>
+        <w:spacing w:after="90" w:line="280" w:lineRule="auto"/>
+        <w:jc w:val="left"/>
+      </w:pPr>
+      <w:r>
+        <w:rPr>
+          <w:rFonts w:ascii="Times New Roman" w:hAnsi="Times New Roman" w:eastAsia="宋体"/>
+          <w:color w:val="000000"/>
+          <w:sz w:val="22"/>
+        </w:rPr>
+        <w:t xml:space="preserve">在参考知识库评测之后，使用本人提供的DeepSeek API追加实际答案生成、三元组抽取、社区摘要和Wiki条目构建。原基线保持不变；新知识库另行评测并审计生成错误，人工评分仍待确认。</w:t>
+      </w:r>
+    </w:p>
+    <w:p>
+      <w:pPr>
         <w:keepNext/>
         <w:keepLines/>
         <w:spacing w:before="160" w:after="80" w:line="276" w:lineRule="auto"/>
@@ -781,7 +796,7 @@
                 <w:color w:val="000000"/>
                 <w:sz w:val="20"/>
               </w:rPr>
-              <w:t xml:space="preserve">仅检索评测；无生成API调用</w:t>
+              <w:t xml:space="preserve">deepseek-flash；temperature=0；关闭thinking</w:t>
             </w:r>
           </w:p>
         </w:tc>
@@ -808,7 +823,7 @@
                 <w:color w:val="000000"/>
                 <w:sz w:val="20"/>
               </w:rPr>
-              <w:t xml:space="preserve">Codex一次性整理九个有来源答案，评分是AI初评</w:t>
+              <w:t xml:space="preserve">61次真实调用；同模型AI初评，非人工评分</w:t>
             </w:r>
           </w:p>
         </w:tc>
@@ -1187,6 +1202,21 @@
         <w:t xml:space="preserve">Local最多匹配2个实体，从入边与出边双向展开；最多3跳、每轮前沿最多6节点，节点与三元组边分别去重，稳定处理同分项。候选三元组按余弦排名，文档分数等价于该文档候选边的最大分数。没有匹配边时回退Global，并记录fallback。</w:t>
       </w:r>
     </w:p>
+    <w:p>
+      <w:pPr>
+        <w:keepLines/>
+        <w:spacing w:after="90" w:line="280" w:lineRule="auto"/>
+        <w:jc w:val="left"/>
+      </w:pPr>
+      <w:r>
+        <w:rPr>
+          <w:rFonts w:ascii="Times New Roman" w:hAnsi="Times New Roman" w:eastAsia="宋体"/>
+          <w:color w:val="000000"/>
+          <w:sz w:val="22"/>
+        </w:rPr>
+        <w:t xml:space="preserve">上述40三元组与3段预置摘要用于参考基线；现场版本另由15篇原文抽出65条归一三元组、73节点、14社区，并对每个实际社区生成摘要，不替换参考图。社区来源仅取内部边所关联的文档。</w:t>
+      </w:r>
+    </w:p>
     <w:tbl>
       <w:tblPr>
         <w:tblStyle w:val="TableGrid"/>
@@ -2005,6 +2035,21 @@
           <w:sz w:val="22"/>
         </w:rPr>
         <w:t xml:space="preserve">例如“人工智能学院”聚合doc02的院长和系、doc10的重点实验室、doc15的联合培养。条目减少跨文档阅读，但学院条目不含教师研究方向，校园条目省略校巴频率等细节；它还加入了原文没有的联合培养人数和教材名称。</w:t>
+      </w:r>
+    </w:p>
+    <w:p>
+      <w:pPr>
+        <w:keepLines/>
+        <w:spacing w:after="90" w:line="280" w:lineRule="auto"/>
+        <w:jc w:val="left"/>
+      </w:pPr>
+      <w:r>
+        <w:rPr>
+          <w:rFonts w:ascii="Times New Roman" w:hAnsi="Times New Roman" w:eastAsia="宋体"/>
+          <w:color w:val="000000"/>
+          <w:sz w:val="22"/>
+        </w:rPr>
+        <w:t xml:space="preserve">现场Wiki沿用这9个主题及来源列表，正文全部由DeepSeek重新生成。这样可以比较条目文本改变后的排序，同时保留来源选择的影响；并非自动发现新主题或从全部语料自由建条目。</w:t>
       </w:r>
     </w:p>
     <w:p>
@@ -7236,7 +7281,6 @@
     </w:p>
     <w:p>
       <w:pPr>
-        <w:keepNext/>
         <w:spacing w:before="120" w:after="60" w:line="264" w:lineRule="auto"/>
         <w:jc w:val="center"/>
       </w:pPr>
@@ -7247,7 +7291,7 @@
           <w:color w:val="4B5563"/>
           <w:sz w:val="21"/>
         </w:rPr>
-        <w:t xml:space="preserve">表 5  忠实度 AI 初评 待人工确认</w:t>
+        <w:t xml:space="preserve">表 5  DeepSeek答案忠实度AI初评 待人工确认</w:t>
       </w:r>
     </w:p>
     <w:p>
@@ -7262,7 +7306,7 @@
           <w:color w:val="000000"/>
           <w:sz w:val="22"/>
         </w:rPr>
-        <w:t xml:space="preserve">预选Q01/Q06/Q11，覆盖三类题。Codex只据各自K=5返回原文整理答案，无生成API；完整答案、上下文和声明见answer_review.json。human_score为空，以下AI初评仍待人工核查。</w:t>
+        <w:t xml:space="preserve">预选Q01/Q06/Q11，覆盖三类题；九例都使用参考基线K=5返回的原始文档，调用DeepSeek生成，再以同模型评审。请求不含gold、参考答案或人工分数。表中为压缩要点，完整回答、声明及原文在results/live_api/answer_review.json，请求与响应在calls/；human_score均为空。</w:t>
       </w:r>
     </w:p>
     <w:tbl>
@@ -7273,11 +7317,11 @@
         <w:tblLayout w:type="fixed"/>
       </w:tblPr>
       <w:tblGrid>
-        <w:gridCol w:w="1600"/>
-        <w:gridCol w:w="700"/>
-        <w:gridCol w:w="1400"/>
-        <w:gridCol w:w="3400"/>
-        <w:gridCol w:w="1540"/>
+        <w:gridCol w:w="1430"/>
+        <w:gridCol w:w="570"/>
+        <w:gridCol w:w="1000"/>
+        <w:gridCol w:w="3510"/>
+        <w:gridCol w:w="2130"/>
       </w:tblGrid>
       <w:tr>
         <w:trPr>
@@ -7286,7 +7330,7 @@
         </w:trPr>
         <w:tc>
           <w:tcPr>
-            <w:tcW w:w="1600" w:type="dxa"/>
+            <w:tcW w:w="1430" w:type="dxa"/>
             <w:vAlign w:val="center"/>
             <w:tcMar>
               <w:top w:w="65" w:type="dxa"/>
@@ -7314,7 +7358,7 @@
         </w:tc>
         <w:tc>
           <w:tcPr>
-            <w:tcW w:w="700" w:type="dxa"/>
+            <w:tcW w:w="570" w:type="dxa"/>
             <w:vAlign w:val="center"/>
             <w:tcMar>
               <w:top w:w="65" w:type="dxa"/>
@@ -7342,7 +7386,7 @@
         </w:tc>
         <w:tc>
           <w:tcPr>
-            <w:tcW w:w="1400" w:type="dxa"/>
+            <w:tcW w:w="1000" w:type="dxa"/>
             <w:vAlign w:val="center"/>
             <w:tcMar>
               <w:top w:w="65" w:type="dxa"/>
@@ -7364,13 +7408,13 @@
                 <w:color w:val="000000"/>
                 <w:sz w:val="20"/>
               </w:rPr>
-              <w:t xml:space="preserve">AI初评</w:t>
-            </w:r>
-          </w:p>
-        </w:tc>
-        <w:tc>
-          <w:tcPr>
-            <w:tcW w:w="3400" w:type="dxa"/>
+              <w:t xml:space="preserve">初评分</w:t>
+            </w:r>
+          </w:p>
+        </w:tc>
+        <w:tc>
+          <w:tcPr>
+            <w:tcW w:w="3510" w:type="dxa"/>
             <w:vAlign w:val="center"/>
             <w:tcMar>
               <w:top w:w="65" w:type="dxa"/>
@@ -7392,13 +7436,13 @@
                 <w:color w:val="000000"/>
                 <w:sz w:val="20"/>
               </w:rPr>
-              <w:t xml:space="preserve">关键句摘录</w:t>
-            </w:r>
-          </w:p>
-        </w:tc>
-        <w:tc>
-          <w:tcPr>
-            <w:tcW w:w="1540" w:type="dxa"/>
+              <w:t xml:space="preserve">回答要点摘录</w:t>
+            </w:r>
+          </w:p>
+        </w:tc>
+        <w:tc>
+          <w:tcPr>
+            <w:tcW w:w="2130" w:type="dxa"/>
             <w:vAlign w:val="center"/>
             <w:tcMar>
               <w:top w:w="65" w:type="dxa"/>
@@ -7420,7 +7464,7 @@
                 <w:color w:val="000000"/>
                 <w:sz w:val="20"/>
               </w:rPr>
-              <w:t xml:space="preserve">无依据断言 / 完整性</w:t>
+              <w:t xml:space="preserve">声明核查 / 完整性</w:t>
             </w:r>
           </w:p>
         </w:tc>
@@ -7431,7 +7475,7 @@
         </w:trPr>
         <w:tc>
           <w:tcPr>
-            <w:tcW w:w="1600" w:type="dxa"/>
+            <w:tcW w:w="1430" w:type="dxa"/>
             <w:vAlign w:val="center"/>
             <w:tcMar>
               <w:top w:w="65" w:type="dxa"/>
@@ -7458,7 +7502,7 @@
         </w:tc>
         <w:tc>
           <w:tcPr>
-            <w:tcW w:w="700" w:type="dxa"/>
+            <w:tcW w:w="570" w:type="dxa"/>
             <w:vAlign w:val="center"/>
             <w:tcMar>
               <w:top w:w="65" w:type="dxa"/>
@@ -7485,82 +7529,84 @@
         </w:tc>
         <w:tc>
           <w:tcPr>
-            <w:tcW w:w="1400" w:type="dxa"/>
-            <w:vAlign w:val="center"/>
-            <w:tcMar>
-              <w:top w:w="65" w:type="dxa"/>
-              <w:bottom w:w="65" w:type="dxa"/>
-              <w:left w:w="80" w:type="dxa"/>
-              <w:right w:w="80" w:type="dxa"/>
-            </w:tcMar>
-          </w:tcPr>
-          <w:p>
-            <w:pPr>
-              <w:keepLines/>
-              <w:spacing w:after="0" w:line="250" w:lineRule="auto"/>
-              <w:jc w:val="left"/>
-            </w:pPr>
-            <w:r>
-              <w:rPr>
-                <w:rFonts w:ascii="Times New Roman" w:hAnsi="Times New Roman" w:eastAsia="宋体"/>
-                <w:color w:val="000000"/>
-                <w:sz w:val="20"/>
-              </w:rPr>
-              <w:t xml:space="preserve">5 / 待确认</w:t>
-            </w:r>
-          </w:p>
-        </w:tc>
-        <w:tc>
-          <w:tcPr>
-            <w:tcW w:w="3400" w:type="dxa"/>
-            <w:vAlign w:val="center"/>
-            <w:tcMar>
-              <w:top w:w="65" w:type="dxa"/>
-              <w:bottom w:w="65" w:type="dxa"/>
-              <w:left w:w="80" w:type="dxa"/>
-              <w:right w:w="80" w:type="dxa"/>
-            </w:tcMar>
-          </w:tcPr>
-          <w:p>
-            <w:pPr>
-              <w:keepLines/>
-              <w:spacing w:after="0" w:line="250" w:lineRule="auto"/>
-              <w:jc w:val="left"/>
-            </w:pPr>
-            <w:r>
-              <w:rPr>
-                <w:rFonts w:ascii="Times New Roman" w:hAnsi="Times New Roman" w:eastAsia="宋体"/>
-                <w:color w:val="000000"/>
-                <w:sz w:val="20"/>
-              </w:rPr>
-              <w:t xml:space="preserve">该学院院长是王启明教授[doc02]。因此行政负责人为王启明。</w:t>
-            </w:r>
-          </w:p>
-        </w:tc>
-        <w:tc>
-          <w:tcPr>
-            <w:tcW w:w="1540" w:type="dxa"/>
-            <w:vAlign w:val="center"/>
-            <w:tcMar>
-              <w:top w:w="65" w:type="dxa"/>
-              <w:bottom w:w="65" w:type="dxa"/>
-              <w:left w:w="80" w:type="dxa"/>
-              <w:right w:w="80" w:type="dxa"/>
-            </w:tcMar>
-          </w:tcPr>
-          <w:p>
-            <w:pPr>
-              <w:keepLines/>
-              <w:spacing w:after="0" w:line="250" w:lineRule="auto"/>
-              <w:jc w:val="left"/>
-            </w:pPr>
-            <w:r>
-              <w:rPr>
-                <w:rFonts w:ascii="Times New Roman" w:hAnsi="Times New Roman" w:eastAsia="宋体"/>
-                <w:color w:val="000000"/>
-                <w:sz w:val="20"/>
-              </w:rPr>
-              <w:t xml:space="preserve">无；已回答</w:t>
+            <w:tcW w:w="1000" w:type="dxa"/>
+            <w:vAlign w:val="center"/>
+            <w:tcMar>
+              <w:top w:w="65" w:type="dxa"/>
+              <w:bottom w:w="65" w:type="dxa"/>
+              <w:left w:w="80" w:type="dxa"/>
+              <w:right w:w="80" w:type="dxa"/>
+            </w:tcMar>
+          </w:tcPr>
+          <w:p>
+            <w:pPr>
+              <w:keepLines/>
+              <w:spacing w:after="0" w:line="250" w:lineRule="auto"/>
+              <w:jc w:val="left"/>
+            </w:pPr>
+            <w:r>
+              <w:rPr>
+                <w:rFonts w:ascii="Times New Roman" w:hAnsi="Times New Roman" w:eastAsia="宋体"/>
+                <w:color w:val="000000"/>
+                <w:sz w:val="20"/>
+              </w:rPr>
+              <w:t xml:space="preserve">5</w:t>
+              <w:br/>
+              <w:t xml:space="preserve">待确认</w:t>
+            </w:r>
+          </w:p>
+        </w:tc>
+        <w:tc>
+          <w:tcPr>
+            <w:tcW w:w="3510" w:type="dxa"/>
+            <w:vAlign w:val="center"/>
+            <w:tcMar>
+              <w:top w:w="65" w:type="dxa"/>
+              <w:bottom w:w="65" w:type="dxa"/>
+              <w:left w:w="80" w:type="dxa"/>
+              <w:right w:w="80" w:type="dxa"/>
+            </w:tcMar>
+          </w:tcPr>
+          <w:p>
+            <w:pPr>
+              <w:keepLines/>
+              <w:spacing w:after="0" w:line="250" w:lineRule="auto"/>
+              <w:jc w:val="left"/>
+            </w:pPr>
+            <w:r>
+              <w:rPr>
+                <w:rFonts w:ascii="Times New Roman" w:hAnsi="Times New Roman" w:eastAsia="宋体"/>
+                <w:color w:val="000000"/>
+                <w:sz w:val="20"/>
+              </w:rPr>
+              <w:t xml:space="preserve">授课教师是李文瀚[doc06]，他属于人工智能学院[doc04]；院长为王启明[doc02]。</w:t>
+            </w:r>
+          </w:p>
+        </w:tc>
+        <w:tc>
+          <w:tcPr>
+            <w:tcW w:w="2130" w:type="dxa"/>
+            <w:vAlign w:val="center"/>
+            <w:tcMar>
+              <w:top w:w="65" w:type="dxa"/>
+              <w:bottom w:w="65" w:type="dxa"/>
+              <w:left w:w="80" w:type="dxa"/>
+              <w:right w:w="80" w:type="dxa"/>
+            </w:tcMar>
+          </w:tcPr>
+          <w:p>
+            <w:pPr>
+              <w:keepLines/>
+              <w:spacing w:after="0" w:line="250" w:lineRule="auto"/>
+              <w:jc w:val="left"/>
+            </w:pPr>
+            <w:r>
+              <w:rPr>
+                <w:rFonts w:ascii="Times New Roman" w:hAnsi="Times New Roman" w:eastAsia="宋体"/>
+                <w:color w:val="000000"/>
+                <w:sz w:val="20"/>
+              </w:rPr>
+              <w:t xml:space="preserve">3/3条受支持；已回答</w:t>
             </w:r>
           </w:p>
         </w:tc>
@@ -7571,7 +7617,7 @@
         </w:trPr>
         <w:tc>
           <w:tcPr>
-            <w:tcW w:w="1600" w:type="dxa"/>
+            <w:tcW w:w="1430" w:type="dxa"/>
             <w:vAlign w:val="center"/>
             <w:tcMar>
               <w:top w:w="65" w:type="dxa"/>
@@ -7598,7 +7644,7 @@
         </w:tc>
         <w:tc>
           <w:tcPr>
-            <w:tcW w:w="700" w:type="dxa"/>
+            <w:tcW w:w="570" w:type="dxa"/>
             <w:vAlign w:val="center"/>
             <w:tcMar>
               <w:top w:w="65" w:type="dxa"/>
@@ -7625,82 +7671,84 @@
         </w:tc>
         <w:tc>
           <w:tcPr>
-            <w:tcW w:w="1400" w:type="dxa"/>
-            <w:vAlign w:val="center"/>
-            <w:tcMar>
-              <w:top w:w="65" w:type="dxa"/>
-              <w:bottom w:w="65" w:type="dxa"/>
-              <w:left w:w="80" w:type="dxa"/>
-              <w:right w:w="80" w:type="dxa"/>
-            </w:tcMar>
-          </w:tcPr>
-          <w:p>
-            <w:pPr>
-              <w:keepLines/>
-              <w:spacing w:after="0" w:line="250" w:lineRule="auto"/>
-              <w:jc w:val="left"/>
-            </w:pPr>
-            <w:r>
-              <w:rPr>
-                <w:rFonts w:ascii="Times New Roman" w:hAnsi="Times New Roman" w:eastAsia="宋体"/>
-                <w:color w:val="000000"/>
-                <w:sz w:val="20"/>
-              </w:rPr>
-              <w:t xml:space="preserve">5 / 待确认</w:t>
-            </w:r>
-          </w:p>
-        </w:tc>
-        <w:tc>
-          <w:tcPr>
-            <w:tcW w:w="3400" w:type="dxa"/>
-            <w:vAlign w:val="center"/>
-            <w:tcMar>
-              <w:top w:w="65" w:type="dxa"/>
-              <w:bottom w:w="65" w:type="dxa"/>
-              <w:left w:w="80" w:type="dxa"/>
-              <w:right w:w="80" w:type="dxa"/>
-            </w:tcMar>
-          </w:tcPr>
-          <w:p>
-            <w:pPr>
-              <w:keepLines/>
-              <w:spacing w:after="0" w:line="250" w:lineRule="auto"/>
-              <w:jc w:val="left"/>
-            </w:pPr>
-            <w:r>
-              <w:rPr>
-                <w:rFonts w:ascii="Times New Roman" w:hAnsi="Times New Roman" w:eastAsia="宋体"/>
-                <w:color w:val="000000"/>
-                <w:sz w:val="20"/>
-              </w:rPr>
-              <w:t xml:space="preserve">云山大学的校训是“格物致知”[doc01]。</w:t>
-            </w:r>
-          </w:p>
-        </w:tc>
-        <w:tc>
-          <w:tcPr>
-            <w:tcW w:w="1540" w:type="dxa"/>
-            <w:vAlign w:val="center"/>
-            <w:tcMar>
-              <w:top w:w="65" w:type="dxa"/>
-              <w:bottom w:w="65" w:type="dxa"/>
-              <w:left w:w="80" w:type="dxa"/>
-              <w:right w:w="80" w:type="dxa"/>
-            </w:tcMar>
-          </w:tcPr>
-          <w:p>
-            <w:pPr>
-              <w:keepLines/>
-              <w:spacing w:after="0" w:line="250" w:lineRule="auto"/>
-              <w:jc w:val="left"/>
-            </w:pPr>
-            <w:r>
-              <w:rPr>
-                <w:rFonts w:ascii="Times New Roman" w:hAnsi="Times New Roman" w:eastAsia="宋体"/>
-                <w:color w:val="000000"/>
-                <w:sz w:val="20"/>
-              </w:rPr>
-              <w:t xml:space="preserve">无；已回答</w:t>
+            <w:tcW w:w="1000" w:type="dxa"/>
+            <w:vAlign w:val="center"/>
+            <w:tcMar>
+              <w:top w:w="65" w:type="dxa"/>
+              <w:bottom w:w="65" w:type="dxa"/>
+              <w:left w:w="80" w:type="dxa"/>
+              <w:right w:w="80" w:type="dxa"/>
+            </w:tcMar>
+          </w:tcPr>
+          <w:p>
+            <w:pPr>
+              <w:keepLines/>
+              <w:spacing w:after="0" w:line="250" w:lineRule="auto"/>
+              <w:jc w:val="left"/>
+            </w:pPr>
+            <w:r>
+              <w:rPr>
+                <w:rFonts w:ascii="Times New Roman" w:hAnsi="Times New Roman" w:eastAsia="宋体"/>
+                <w:color w:val="000000"/>
+                <w:sz w:val="20"/>
+              </w:rPr>
+              <w:t xml:space="preserve">5</w:t>
+              <w:br/>
+              <w:t xml:space="preserve">待确认</w:t>
+            </w:r>
+          </w:p>
+        </w:tc>
+        <w:tc>
+          <w:tcPr>
+            <w:tcW w:w="3510" w:type="dxa"/>
+            <w:vAlign w:val="center"/>
+            <w:tcMar>
+              <w:top w:w="65" w:type="dxa"/>
+              <w:bottom w:w="65" w:type="dxa"/>
+              <w:left w:w="80" w:type="dxa"/>
+              <w:right w:w="80" w:type="dxa"/>
+            </w:tcMar>
+          </w:tcPr>
+          <w:p>
+            <w:pPr>
+              <w:keepLines/>
+              <w:spacing w:after="0" w:line="250" w:lineRule="auto"/>
+              <w:jc w:val="left"/>
+            </w:pPr>
+            <w:r>
+              <w:rPr>
+                <w:rFonts w:ascii="Times New Roman" w:hAnsi="Times New Roman" w:eastAsia="宋体"/>
+                <w:color w:val="000000"/>
+                <w:sz w:val="20"/>
+              </w:rPr>
+              <w:t xml:space="preserve">校训是「格物致知」[doc01]。</w:t>
+            </w:r>
+          </w:p>
+        </w:tc>
+        <w:tc>
+          <w:tcPr>
+            <w:tcW w:w="2130" w:type="dxa"/>
+            <w:vAlign w:val="center"/>
+            <w:tcMar>
+              <w:top w:w="65" w:type="dxa"/>
+              <w:bottom w:w="65" w:type="dxa"/>
+              <w:left w:w="80" w:type="dxa"/>
+              <w:right w:w="80" w:type="dxa"/>
+            </w:tcMar>
+          </w:tcPr>
+          <w:p>
+            <w:pPr>
+              <w:keepLines/>
+              <w:spacing w:after="0" w:line="250" w:lineRule="auto"/>
+              <w:jc w:val="left"/>
+            </w:pPr>
+            <w:r>
+              <w:rPr>
+                <w:rFonts w:ascii="Times New Roman" w:hAnsi="Times New Roman" w:eastAsia="宋体"/>
+                <w:color w:val="000000"/>
+                <w:sz w:val="20"/>
+              </w:rPr>
+              <w:t xml:space="preserve">1/1条受支持；已回答</w:t>
             </w:r>
           </w:p>
         </w:tc>
@@ -7711,7 +7759,7 @@
         </w:trPr>
         <w:tc>
           <w:tcPr>
-            <w:tcW w:w="1600" w:type="dxa"/>
+            <w:tcW w:w="1430" w:type="dxa"/>
             <w:vAlign w:val="center"/>
             <w:tcMar>
               <w:top w:w="65" w:type="dxa"/>
@@ -7738,7 +7786,7 @@
         </w:tc>
         <w:tc>
           <w:tcPr>
-            <w:tcW w:w="700" w:type="dxa"/>
+            <w:tcW w:w="570" w:type="dxa"/>
             <w:vAlign w:val="center"/>
             <w:tcMar>
               <w:top w:w="65" w:type="dxa"/>
@@ -7765,82 +7813,84 @@
         </w:tc>
         <w:tc>
           <w:tcPr>
-            <w:tcW w:w="1400" w:type="dxa"/>
-            <w:vAlign w:val="center"/>
-            <w:tcMar>
-              <w:top w:w="65" w:type="dxa"/>
-              <w:bottom w:w="65" w:type="dxa"/>
-              <w:left w:w="80" w:type="dxa"/>
-              <w:right w:w="80" w:type="dxa"/>
-            </w:tcMar>
-          </w:tcPr>
-          <w:p>
-            <w:pPr>
-              <w:keepLines/>
-              <w:spacing w:after="0" w:line="250" w:lineRule="auto"/>
-              <w:jc w:val="left"/>
-            </w:pPr>
-            <w:r>
-              <w:rPr>
-                <w:rFonts w:ascii="Times New Roman" w:hAnsi="Times New Roman" w:eastAsia="宋体"/>
-                <w:color w:val="000000"/>
-                <w:sz w:val="20"/>
-              </w:rPr>
-              <w:t xml:space="preserve">5 / 待确认</w:t>
-            </w:r>
-          </w:p>
-        </w:tc>
-        <w:tc>
-          <w:tcPr>
-            <w:tcW w:w="3400" w:type="dxa"/>
-            <w:vAlign w:val="center"/>
-            <w:tcMar>
-              <w:top w:w="65" w:type="dxa"/>
-              <w:bottom w:w="65" w:type="dxa"/>
-              <w:left w:w="80" w:type="dxa"/>
-              <w:right w:w="80" w:type="dxa"/>
-            </w:tcMar>
-          </w:tcPr>
-          <w:p>
-            <w:pPr>
-              <w:keepLines/>
-              <w:spacing w:after="0" w:line="250" w:lineRule="auto"/>
-              <w:jc w:val="left"/>
-            </w:pPr>
-            <w:r>
-              <w:rPr>
-                <w:rFonts w:ascii="Times New Roman" w:hAnsi="Times New Roman" w:eastAsia="宋体"/>
-                <w:color w:val="000000"/>
-                <w:sz w:val="20"/>
-              </w:rPr>
-              <w:t xml:space="preserve">岭南超算中心由云山大学与省科技厅共建，计算机学院参与运行管理[doc10]。</w:t>
-            </w:r>
-          </w:p>
-        </w:tc>
-        <w:tc>
-          <w:tcPr>
-            <w:tcW w:w="1540" w:type="dxa"/>
-            <w:vAlign w:val="center"/>
-            <w:tcMar>
-              <w:top w:w="65" w:type="dxa"/>
-              <w:bottom w:w="65" w:type="dxa"/>
-              <w:left w:w="80" w:type="dxa"/>
-              <w:right w:w="80" w:type="dxa"/>
-            </w:tcMar>
-          </w:tcPr>
-          <w:p>
-            <w:pPr>
-              <w:keepLines/>
-              <w:spacing w:after="0" w:line="250" w:lineRule="auto"/>
-              <w:jc w:val="left"/>
-            </w:pPr>
-            <w:r>
-              <w:rPr>
-                <w:rFonts w:ascii="Times New Roman" w:hAnsi="Times New Roman" w:eastAsia="宋体"/>
-                <w:color w:val="000000"/>
-                <w:sz w:val="20"/>
-              </w:rPr>
-              <w:t xml:space="preserve">无；已回答</w:t>
+            <w:tcW w:w="1000" w:type="dxa"/>
+            <w:vAlign w:val="center"/>
+            <w:tcMar>
+              <w:top w:w="65" w:type="dxa"/>
+              <w:bottom w:w="65" w:type="dxa"/>
+              <w:left w:w="80" w:type="dxa"/>
+              <w:right w:w="80" w:type="dxa"/>
+            </w:tcMar>
+          </w:tcPr>
+          <w:p>
+            <w:pPr>
+              <w:keepLines/>
+              <w:spacing w:after="0" w:line="250" w:lineRule="auto"/>
+              <w:jc w:val="left"/>
+            </w:pPr>
+            <w:r>
+              <w:rPr>
+                <w:rFonts w:ascii="Times New Roman" w:hAnsi="Times New Roman" w:eastAsia="宋体"/>
+                <w:color w:val="000000"/>
+                <w:sz w:val="20"/>
+              </w:rPr>
+              <w:t xml:space="preserve">5</w:t>
+              <w:br/>
+              <w:t xml:space="preserve">待确认</w:t>
+            </w:r>
+          </w:p>
+        </w:tc>
+        <w:tc>
+          <w:tcPr>
+            <w:tcW w:w="3510" w:type="dxa"/>
+            <w:vAlign w:val="center"/>
+            <w:tcMar>
+              <w:top w:w="65" w:type="dxa"/>
+              <w:bottom w:w="65" w:type="dxa"/>
+              <w:left w:w="80" w:type="dxa"/>
+              <w:right w:w="80" w:type="dxa"/>
+            </w:tcMar>
+          </w:tcPr>
+          <w:p>
+            <w:pPr>
+              <w:keepLines/>
+              <w:spacing w:after="0" w:line="250" w:lineRule="auto"/>
+              <w:jc w:val="left"/>
+            </w:pPr>
+            <w:r>
+              <w:rPr>
+                <w:rFonts w:ascii="Times New Roman" w:hAnsi="Times New Roman" w:eastAsia="宋体"/>
+                <w:color w:val="000000"/>
+                <w:sz w:val="20"/>
+              </w:rPr>
+              <w:t xml:space="preserve">全国重点实验室依托人工智能学院；超算中心由大学与省科技厅共建，计算机学院参与运行管理[doc10]。</w:t>
+            </w:r>
+          </w:p>
+        </w:tc>
+        <w:tc>
+          <w:tcPr>
+            <w:tcW w:w="2130" w:type="dxa"/>
+            <w:vAlign w:val="center"/>
+            <w:tcMar>
+              <w:top w:w="65" w:type="dxa"/>
+              <w:bottom w:w="65" w:type="dxa"/>
+              <w:left w:w="80" w:type="dxa"/>
+              <w:right w:w="80" w:type="dxa"/>
+            </w:tcMar>
+          </w:tcPr>
+          <w:p>
+            <w:pPr>
+              <w:keepLines/>
+              <w:spacing w:after="0" w:line="250" w:lineRule="auto"/>
+              <w:jc w:val="left"/>
+            </w:pPr>
+            <w:r>
+              <w:rPr>
+                <w:rFonts w:ascii="Times New Roman" w:hAnsi="Times New Roman" w:eastAsia="宋体"/>
+                <w:color w:val="000000"/>
+                <w:sz w:val="20"/>
+              </w:rPr>
+              <w:t xml:space="preserve">4/4条受支持；已回答</w:t>
             </w:r>
           </w:p>
         </w:tc>
@@ -7851,7 +7901,7 @@
         </w:trPr>
         <w:tc>
           <w:tcPr>
-            <w:tcW w:w="1600" w:type="dxa"/>
+            <w:tcW w:w="1430" w:type="dxa"/>
             <w:vAlign w:val="center"/>
             <w:tcMar>
               <w:top w:w="65" w:type="dxa"/>
@@ -7878,7 +7928,7 @@
         </w:tc>
         <w:tc>
           <w:tcPr>
-            <w:tcW w:w="700" w:type="dxa"/>
+            <w:tcW w:w="570" w:type="dxa"/>
             <w:vAlign w:val="center"/>
             <w:tcMar>
               <w:top w:w="65" w:type="dxa"/>
@@ -7905,82 +7955,84 @@
         </w:tc>
         <w:tc>
           <w:tcPr>
-            <w:tcW w:w="1400" w:type="dxa"/>
-            <w:vAlign w:val="center"/>
-            <w:tcMar>
-              <w:top w:w="65" w:type="dxa"/>
-              <w:bottom w:w="65" w:type="dxa"/>
-              <w:left w:w="80" w:type="dxa"/>
-              <w:right w:w="80" w:type="dxa"/>
-            </w:tcMar>
-          </w:tcPr>
-          <w:p>
-            <w:pPr>
-              <w:keepLines/>
-              <w:spacing w:after="0" w:line="250" w:lineRule="auto"/>
-              <w:jc w:val="left"/>
-            </w:pPr>
-            <w:r>
-              <w:rPr>
-                <w:rFonts w:ascii="Times New Roman" w:hAnsi="Times New Roman" w:eastAsia="宋体"/>
-                <w:color w:val="000000"/>
-                <w:sz w:val="20"/>
-              </w:rPr>
-              <w:t xml:space="preserve">5 / 待确认</w:t>
-            </w:r>
-          </w:p>
-        </w:tc>
-        <w:tc>
-          <w:tcPr>
-            <w:tcW w:w="3400" w:type="dxa"/>
-            <w:vAlign w:val="center"/>
-            <w:tcMar>
-              <w:top w:w="65" w:type="dxa"/>
-              <w:bottom w:w="65" w:type="dxa"/>
-              <w:left w:w="80" w:type="dxa"/>
-              <w:right w:w="80" w:type="dxa"/>
-            </w:tcMar>
-          </w:tcPr>
-          <w:p>
-            <w:pPr>
-              <w:keepLines/>
-              <w:spacing w:after="0" w:line="250" w:lineRule="auto"/>
-              <w:jc w:val="left"/>
-            </w:pPr>
-            <w:r>
-              <w:rPr>
-                <w:rFonts w:ascii="Times New Roman" w:hAnsi="Times New Roman" w:eastAsia="宋体"/>
-                <w:color w:val="000000"/>
-                <w:sz w:val="20"/>
-              </w:rPr>
-              <w:t xml:space="preserve">该学院院长是王启明教授[doc02]。因此行政负责人为王启明。</w:t>
-            </w:r>
-          </w:p>
-        </w:tc>
-        <w:tc>
-          <w:tcPr>
-            <w:tcW w:w="1540" w:type="dxa"/>
-            <w:vAlign w:val="center"/>
-            <w:tcMar>
-              <w:top w:w="65" w:type="dxa"/>
-              <w:bottom w:w="65" w:type="dxa"/>
-              <w:left w:w="80" w:type="dxa"/>
-              <w:right w:w="80" w:type="dxa"/>
-            </w:tcMar>
-          </w:tcPr>
-          <w:p>
-            <w:pPr>
-              <w:keepLines/>
-              <w:spacing w:after="0" w:line="250" w:lineRule="auto"/>
-              <w:jc w:val="left"/>
-            </w:pPr>
-            <w:r>
-              <w:rPr>
-                <w:rFonts w:ascii="Times New Roman" w:hAnsi="Times New Roman" w:eastAsia="宋体"/>
-                <w:color w:val="000000"/>
-                <w:sz w:val="20"/>
-              </w:rPr>
-              <w:t xml:space="preserve">无；已回答</w:t>
+            <w:tcW w:w="1000" w:type="dxa"/>
+            <w:vAlign w:val="center"/>
+            <w:tcMar>
+              <w:top w:w="65" w:type="dxa"/>
+              <w:bottom w:w="65" w:type="dxa"/>
+              <w:left w:w="80" w:type="dxa"/>
+              <w:right w:w="80" w:type="dxa"/>
+            </w:tcMar>
+          </w:tcPr>
+          <w:p>
+            <w:pPr>
+              <w:keepLines/>
+              <w:spacing w:after="0" w:line="250" w:lineRule="auto"/>
+              <w:jc w:val="left"/>
+            </w:pPr>
+            <w:r>
+              <w:rPr>
+                <w:rFonts w:ascii="Times New Roman" w:hAnsi="Times New Roman" w:eastAsia="宋体"/>
+                <w:color w:val="000000"/>
+                <w:sz w:val="20"/>
+              </w:rPr>
+              <w:t xml:space="preserve">5</w:t>
+              <w:br/>
+              <w:t xml:space="preserve">待确认</w:t>
+            </w:r>
+          </w:p>
+        </w:tc>
+        <w:tc>
+          <w:tcPr>
+            <w:tcW w:w="3510" w:type="dxa"/>
+            <w:vAlign w:val="center"/>
+            <w:tcMar>
+              <w:top w:w="65" w:type="dxa"/>
+              <w:bottom w:w="65" w:type="dxa"/>
+              <w:left w:w="80" w:type="dxa"/>
+              <w:right w:w="80" w:type="dxa"/>
+            </w:tcMar>
+          </w:tcPr>
+          <w:p>
+            <w:pPr>
+              <w:keepLines/>
+              <w:spacing w:after="0" w:line="250" w:lineRule="auto"/>
+              <w:jc w:val="left"/>
+            </w:pPr>
+            <w:r>
+              <w:rPr>
+                <w:rFonts w:ascii="Times New Roman" w:hAnsi="Times New Roman" w:eastAsia="宋体"/>
+                <w:color w:val="000000"/>
+                <w:sz w:val="20"/>
+              </w:rPr>
+              <w:t xml:space="preserve">李文瀚[doc06]属于人工智能学院[doc04]；院长为王启明[doc02]。</w:t>
+            </w:r>
+          </w:p>
+        </w:tc>
+        <w:tc>
+          <w:tcPr>
+            <w:tcW w:w="2130" w:type="dxa"/>
+            <w:vAlign w:val="center"/>
+            <w:tcMar>
+              <w:top w:w="65" w:type="dxa"/>
+              <w:bottom w:w="65" w:type="dxa"/>
+              <w:left w:w="80" w:type="dxa"/>
+              <w:right w:w="80" w:type="dxa"/>
+            </w:tcMar>
+          </w:tcPr>
+          <w:p>
+            <w:pPr>
+              <w:keepLines/>
+              <w:spacing w:after="0" w:line="250" w:lineRule="auto"/>
+              <w:jc w:val="left"/>
+            </w:pPr>
+            <w:r>
+              <w:rPr>
+                <w:rFonts w:ascii="Times New Roman" w:hAnsi="Times New Roman" w:eastAsia="宋体"/>
+                <w:color w:val="000000"/>
+                <w:sz w:val="20"/>
+              </w:rPr>
+              <w:t xml:space="preserve">3/3条受支持；已回答</w:t>
             </w:r>
           </w:p>
         </w:tc>
@@ -7991,7 +8043,7 @@
         </w:trPr>
         <w:tc>
           <w:tcPr>
-            <w:tcW w:w="1600" w:type="dxa"/>
+            <w:tcW w:w="1430" w:type="dxa"/>
             <w:vAlign w:val="center"/>
             <w:tcMar>
               <w:top w:w="65" w:type="dxa"/>
@@ -8018,7 +8070,7 @@
         </w:tc>
         <w:tc>
           <w:tcPr>
-            <w:tcW w:w="700" w:type="dxa"/>
+            <w:tcW w:w="570" w:type="dxa"/>
             <w:vAlign w:val="center"/>
             <w:tcMar>
               <w:top w:w="65" w:type="dxa"/>
@@ -8045,82 +8097,84 @@
         </w:tc>
         <w:tc>
           <w:tcPr>
-            <w:tcW w:w="1400" w:type="dxa"/>
-            <w:vAlign w:val="center"/>
-            <w:tcMar>
-              <w:top w:w="65" w:type="dxa"/>
-              <w:bottom w:w="65" w:type="dxa"/>
-              <w:left w:w="80" w:type="dxa"/>
-              <w:right w:w="80" w:type="dxa"/>
-            </w:tcMar>
-          </w:tcPr>
-          <w:p>
-            <w:pPr>
-              <w:keepLines/>
-              <w:spacing w:after="0" w:line="250" w:lineRule="auto"/>
-              <w:jc w:val="left"/>
-            </w:pPr>
-            <w:r>
-              <w:rPr>
-                <w:rFonts w:ascii="Times New Roman" w:hAnsi="Times New Roman" w:eastAsia="宋体"/>
-                <w:color w:val="000000"/>
-                <w:sz w:val="20"/>
-              </w:rPr>
-              <w:t xml:space="preserve">5 / 待确认</w:t>
-            </w:r>
-          </w:p>
-        </w:tc>
-        <w:tc>
-          <w:tcPr>
-            <w:tcW w:w="3400" w:type="dxa"/>
-            <w:vAlign w:val="center"/>
-            <w:tcMar>
-              <w:top w:w="65" w:type="dxa"/>
-              <w:bottom w:w="65" w:type="dxa"/>
-              <w:left w:w="80" w:type="dxa"/>
-              <w:right w:w="80" w:type="dxa"/>
-            </w:tcMar>
-          </w:tcPr>
-          <w:p>
-            <w:pPr>
-              <w:keepLines/>
-              <w:spacing w:after="0" w:line="250" w:lineRule="auto"/>
-              <w:jc w:val="left"/>
-            </w:pPr>
-            <w:r>
-              <w:rPr>
-                <w:rFonts w:ascii="Times New Roman" w:hAnsi="Times New Roman" w:eastAsia="宋体"/>
-                <w:color w:val="000000"/>
-                <w:sz w:val="20"/>
-              </w:rPr>
-              <w:t xml:space="preserve">云山大学的校训是“格物致知”[doc01]。</w:t>
-            </w:r>
-          </w:p>
-        </w:tc>
-        <w:tc>
-          <w:tcPr>
-            <w:tcW w:w="1540" w:type="dxa"/>
-            <w:vAlign w:val="center"/>
-            <w:tcMar>
-              <w:top w:w="65" w:type="dxa"/>
-              <w:bottom w:w="65" w:type="dxa"/>
-              <w:left w:w="80" w:type="dxa"/>
-              <w:right w:w="80" w:type="dxa"/>
-            </w:tcMar>
-          </w:tcPr>
-          <w:p>
-            <w:pPr>
-              <w:keepLines/>
-              <w:spacing w:after="0" w:line="250" w:lineRule="auto"/>
-              <w:jc w:val="left"/>
-            </w:pPr>
-            <w:r>
-              <w:rPr>
-                <w:rFonts w:ascii="Times New Roman" w:hAnsi="Times New Roman" w:eastAsia="宋体"/>
-                <w:color w:val="000000"/>
-                <w:sz w:val="20"/>
-              </w:rPr>
-              <w:t xml:space="preserve">无；已回答</w:t>
+            <w:tcW w:w="1000" w:type="dxa"/>
+            <w:vAlign w:val="center"/>
+            <w:tcMar>
+              <w:top w:w="65" w:type="dxa"/>
+              <w:bottom w:w="65" w:type="dxa"/>
+              <w:left w:w="80" w:type="dxa"/>
+              <w:right w:w="80" w:type="dxa"/>
+            </w:tcMar>
+          </w:tcPr>
+          <w:p>
+            <w:pPr>
+              <w:keepLines/>
+              <w:spacing w:after="0" w:line="250" w:lineRule="auto"/>
+              <w:jc w:val="left"/>
+            </w:pPr>
+            <w:r>
+              <w:rPr>
+                <w:rFonts w:ascii="Times New Roman" w:hAnsi="Times New Roman" w:eastAsia="宋体"/>
+                <w:color w:val="000000"/>
+                <w:sz w:val="20"/>
+              </w:rPr>
+              <w:t xml:space="preserve">5</w:t>
+              <w:br/>
+              <w:t xml:space="preserve">待确认</w:t>
+            </w:r>
+          </w:p>
+        </w:tc>
+        <w:tc>
+          <w:tcPr>
+            <w:tcW w:w="3510" w:type="dxa"/>
+            <w:vAlign w:val="center"/>
+            <w:tcMar>
+              <w:top w:w="65" w:type="dxa"/>
+              <w:bottom w:w="65" w:type="dxa"/>
+              <w:left w:w="80" w:type="dxa"/>
+              <w:right w:w="80" w:type="dxa"/>
+            </w:tcMar>
+          </w:tcPr>
+          <w:p>
+            <w:pPr>
+              <w:keepLines/>
+              <w:spacing w:after="0" w:line="250" w:lineRule="auto"/>
+              <w:jc w:val="left"/>
+            </w:pPr>
+            <w:r>
+              <w:rPr>
+                <w:rFonts w:ascii="Times New Roman" w:hAnsi="Times New Roman" w:eastAsia="宋体"/>
+                <w:color w:val="000000"/>
+                <w:sz w:val="20"/>
+              </w:rPr>
+              <w:t xml:space="preserve">校训是「格物致知」[doc01]。</w:t>
+            </w:r>
+          </w:p>
+        </w:tc>
+        <w:tc>
+          <w:tcPr>
+            <w:tcW w:w="2130" w:type="dxa"/>
+            <w:vAlign w:val="center"/>
+            <w:tcMar>
+              <w:top w:w="65" w:type="dxa"/>
+              <w:bottom w:w="65" w:type="dxa"/>
+              <w:left w:w="80" w:type="dxa"/>
+              <w:right w:w="80" w:type="dxa"/>
+            </w:tcMar>
+          </w:tcPr>
+          <w:p>
+            <w:pPr>
+              <w:keepLines/>
+              <w:spacing w:after="0" w:line="250" w:lineRule="auto"/>
+              <w:jc w:val="left"/>
+            </w:pPr>
+            <w:r>
+              <w:rPr>
+                <w:rFonts w:ascii="Times New Roman" w:hAnsi="Times New Roman" w:eastAsia="宋体"/>
+                <w:color w:val="000000"/>
+                <w:sz w:val="20"/>
+              </w:rPr>
+              <w:t xml:space="preserve">1/1条受支持；已回答</w:t>
             </w:r>
           </w:p>
         </w:tc>
@@ -8131,7 +8185,7 @@
         </w:trPr>
         <w:tc>
           <w:tcPr>
-            <w:tcW w:w="1600" w:type="dxa"/>
+            <w:tcW w:w="1430" w:type="dxa"/>
             <w:vAlign w:val="center"/>
             <w:tcMar>
               <w:top w:w="65" w:type="dxa"/>
@@ -8158,7 +8212,7 @@
         </w:tc>
         <w:tc>
           <w:tcPr>
-            <w:tcW w:w="700" w:type="dxa"/>
+            <w:tcW w:w="570" w:type="dxa"/>
             <w:vAlign w:val="center"/>
             <w:tcMar>
               <w:top w:w="65" w:type="dxa"/>
@@ -8185,82 +8239,84 @@
         </w:tc>
         <w:tc>
           <w:tcPr>
-            <w:tcW w:w="1400" w:type="dxa"/>
-            <w:vAlign w:val="center"/>
-            <w:tcMar>
-              <w:top w:w="65" w:type="dxa"/>
-              <w:bottom w:w="65" w:type="dxa"/>
-              <w:left w:w="80" w:type="dxa"/>
-              <w:right w:w="80" w:type="dxa"/>
-            </w:tcMar>
-          </w:tcPr>
-          <w:p>
-            <w:pPr>
-              <w:keepLines/>
-              <w:spacing w:after="0" w:line="250" w:lineRule="auto"/>
-              <w:jc w:val="left"/>
-            </w:pPr>
-            <w:r>
-              <w:rPr>
-                <w:rFonts w:ascii="Times New Roman" w:hAnsi="Times New Roman" w:eastAsia="宋体"/>
-                <w:color w:val="000000"/>
-                <w:sz w:val="20"/>
-              </w:rPr>
-              <w:t xml:space="preserve">5 / 待确认</w:t>
-            </w:r>
-          </w:p>
-        </w:tc>
-        <w:tc>
-          <w:tcPr>
-            <w:tcW w:w="3400" w:type="dxa"/>
-            <w:vAlign w:val="center"/>
-            <w:tcMar>
-              <w:top w:w="65" w:type="dxa"/>
-              <w:bottom w:w="65" w:type="dxa"/>
-              <w:left w:w="80" w:type="dxa"/>
-              <w:right w:w="80" w:type="dxa"/>
-            </w:tcMar>
-          </w:tcPr>
-          <w:p>
-            <w:pPr>
-              <w:keepLines/>
-              <w:spacing w:after="0" w:line="250" w:lineRule="auto"/>
-              <w:jc w:val="left"/>
-            </w:pPr>
-            <w:r>
-              <w:rPr>
-                <w:rFonts w:ascii="Times New Roman" w:hAnsi="Times New Roman" w:eastAsia="宋体"/>
-                <w:color w:val="000000"/>
-                <w:sz w:val="20"/>
-              </w:rPr>
-              <w:t xml:space="preserve">本次检索上下文没有科研平台与建设依托关系的资料，无法据此列出完整答案。</w:t>
-            </w:r>
-          </w:p>
-        </w:tc>
-        <w:tc>
-          <w:tcPr>
-            <w:tcW w:w="1540" w:type="dxa"/>
-            <w:vAlign w:val="center"/>
-            <w:tcMar>
-              <w:top w:w="65" w:type="dxa"/>
-              <w:bottom w:w="65" w:type="dxa"/>
-              <w:left w:w="80" w:type="dxa"/>
-              <w:right w:w="80" w:type="dxa"/>
-            </w:tcMar>
-          </w:tcPr>
-          <w:p>
-            <w:pPr>
-              <w:keepLines/>
-              <w:spacing w:after="0" w:line="250" w:lineRule="auto"/>
-              <w:jc w:val="left"/>
-            </w:pPr>
-            <w:r>
-              <w:rPr>
-                <w:rFonts w:ascii="Times New Roman" w:hAnsi="Times New Roman" w:eastAsia="宋体"/>
-                <w:color w:val="000000"/>
-                <w:sz w:val="20"/>
-              </w:rPr>
-              <w:t xml:space="preserve">无；部分回答或拒答</w:t>
+            <w:tcW w:w="1000" w:type="dxa"/>
+            <w:vAlign w:val="center"/>
+            <w:tcMar>
+              <w:top w:w="65" w:type="dxa"/>
+              <w:bottom w:w="65" w:type="dxa"/>
+              <w:left w:w="80" w:type="dxa"/>
+              <w:right w:w="80" w:type="dxa"/>
+            </w:tcMar>
+          </w:tcPr>
+          <w:p>
+            <w:pPr>
+              <w:keepLines/>
+              <w:spacing w:after="0" w:line="250" w:lineRule="auto"/>
+              <w:jc w:val="left"/>
+            </w:pPr>
+            <w:r>
+              <w:rPr>
+                <w:rFonts w:ascii="Times New Roman" w:hAnsi="Times New Roman" w:eastAsia="宋体"/>
+                <w:color w:val="000000"/>
+                <w:sz w:val="20"/>
+              </w:rPr>
+              <w:t xml:space="preserve">5</w:t>
+              <w:br/>
+              <w:t xml:space="preserve">待确认</w:t>
+            </w:r>
+          </w:p>
+        </w:tc>
+        <w:tc>
+          <w:tcPr>
+            <w:tcW w:w="3510" w:type="dxa"/>
+            <w:vAlign w:val="center"/>
+            <w:tcMar>
+              <w:top w:w="65" w:type="dxa"/>
+              <w:bottom w:w="65" w:type="dxa"/>
+              <w:left w:w="80" w:type="dxa"/>
+              <w:right w:w="80" w:type="dxa"/>
+            </w:tcMar>
+          </w:tcPr>
+          <w:p>
+            <w:pPr>
+              <w:keepLines/>
+              <w:spacing w:after="0" w:line="250" w:lineRule="auto"/>
+              <w:jc w:val="left"/>
+            </w:pPr>
+            <w:r>
+              <w:rPr>
+                <w:rFonts w:ascii="Times New Roman" w:hAnsi="Times New Roman" w:eastAsia="宋体"/>
+                <w:color w:val="000000"/>
+                <w:sz w:val="20"/>
+              </w:rPr>
+              <w:t xml:space="preserve">资料中没有科研平台及其依托单位信息，无法回答[doc01]。</w:t>
+            </w:r>
+          </w:p>
+        </w:tc>
+        <w:tc>
+          <w:tcPr>
+            <w:tcW w:w="2130" w:type="dxa"/>
+            <w:vAlign w:val="center"/>
+            <w:tcMar>
+              <w:top w:w="65" w:type="dxa"/>
+              <w:bottom w:w="65" w:type="dxa"/>
+              <w:left w:w="80" w:type="dxa"/>
+              <w:right w:w="80" w:type="dxa"/>
+            </w:tcMar>
+          </w:tcPr>
+          <w:p>
+            <w:pPr>
+              <w:keepLines/>
+              <w:spacing w:after="0" w:line="250" w:lineRule="auto"/>
+              <w:jc w:val="left"/>
+            </w:pPr>
+            <w:r>
+              <w:rPr>
+                <w:rFonts w:ascii="Times New Roman" w:hAnsi="Times New Roman" w:eastAsia="宋体"/>
+                <w:color w:val="000000"/>
+                <w:sz w:val="20"/>
+              </w:rPr>
+              <w:t xml:space="preserve">AI拆分0条；拒答</w:t>
             </w:r>
           </w:p>
         </w:tc>
@@ -8271,7 +8327,7 @@
         </w:trPr>
         <w:tc>
           <w:tcPr>
-            <w:tcW w:w="1600" w:type="dxa"/>
+            <w:tcW w:w="1430" w:type="dxa"/>
             <w:vAlign w:val="center"/>
             <w:tcMar>
               <w:top w:w="65" w:type="dxa"/>
@@ -8298,7 +8354,7 @@
         </w:tc>
         <w:tc>
           <w:tcPr>
-            <w:tcW w:w="700" w:type="dxa"/>
+            <w:tcW w:w="570" w:type="dxa"/>
             <w:vAlign w:val="center"/>
             <w:tcMar>
               <w:top w:w="65" w:type="dxa"/>
@@ -8325,82 +8381,84 @@
         </w:tc>
         <w:tc>
           <w:tcPr>
-            <w:tcW w:w="1400" w:type="dxa"/>
-            <w:vAlign w:val="center"/>
-            <w:tcMar>
-              <w:top w:w="65" w:type="dxa"/>
-              <w:bottom w:w="65" w:type="dxa"/>
-              <w:left w:w="80" w:type="dxa"/>
-              <w:right w:w="80" w:type="dxa"/>
-            </w:tcMar>
-          </w:tcPr>
-          <w:p>
-            <w:pPr>
-              <w:keepLines/>
-              <w:spacing w:after="0" w:line="250" w:lineRule="auto"/>
-              <w:jc w:val="left"/>
-            </w:pPr>
-            <w:r>
-              <w:rPr>
-                <w:rFonts w:ascii="Times New Roman" w:hAnsi="Times New Roman" w:eastAsia="宋体"/>
-                <w:color w:val="000000"/>
-                <w:sz w:val="20"/>
-              </w:rPr>
-              <w:t xml:space="preserve">5 / 待确认</w:t>
-            </w:r>
-          </w:p>
-        </w:tc>
-        <w:tc>
-          <w:tcPr>
-            <w:tcW w:w="3400" w:type="dxa"/>
-            <w:vAlign w:val="center"/>
-            <w:tcMar>
-              <w:top w:w="65" w:type="dxa"/>
-              <w:bottom w:w="65" w:type="dxa"/>
-              <w:left w:w="80" w:type="dxa"/>
-              <w:right w:w="80" w:type="dxa"/>
-            </w:tcMar>
-          </w:tcPr>
-          <w:p>
-            <w:pPr>
-              <w:keepLines/>
-              <w:spacing w:after="0" w:line="250" w:lineRule="auto"/>
-              <w:jc w:val="left"/>
-            </w:pPr>
-            <w:r>
-              <w:rPr>
-                <w:rFonts w:ascii="Times New Roman" w:hAnsi="Times New Roman" w:eastAsia="宋体"/>
-                <w:color w:val="000000"/>
-                <w:sz w:val="20"/>
-              </w:rPr>
-              <w:t xml:space="preserve">本次检索未返回学院院长资料，无法确认行政负责人。</w:t>
-            </w:r>
-          </w:p>
-        </w:tc>
-        <w:tc>
-          <w:tcPr>
-            <w:tcW w:w="1540" w:type="dxa"/>
-            <w:vAlign w:val="center"/>
-            <w:tcMar>
-              <w:top w:w="65" w:type="dxa"/>
-              <w:bottom w:w="65" w:type="dxa"/>
-              <w:left w:w="80" w:type="dxa"/>
-              <w:right w:w="80" w:type="dxa"/>
-            </w:tcMar>
-          </w:tcPr>
-          <w:p>
-            <w:pPr>
-              <w:keepLines/>
-              <w:spacing w:after="0" w:line="250" w:lineRule="auto"/>
-              <w:jc w:val="left"/>
-            </w:pPr>
-            <w:r>
-              <w:rPr>
-                <w:rFonts w:ascii="Times New Roman" w:hAnsi="Times New Roman" w:eastAsia="宋体"/>
-                <w:color w:val="000000"/>
-                <w:sz w:val="20"/>
-              </w:rPr>
-              <w:t xml:space="preserve">无；部分回答或拒答</w:t>
+            <w:tcW w:w="1000" w:type="dxa"/>
+            <w:vAlign w:val="center"/>
+            <w:tcMar>
+              <w:top w:w="65" w:type="dxa"/>
+              <w:bottom w:w="65" w:type="dxa"/>
+              <w:left w:w="80" w:type="dxa"/>
+              <w:right w:w="80" w:type="dxa"/>
+            </w:tcMar>
+          </w:tcPr>
+          <w:p>
+            <w:pPr>
+              <w:keepLines/>
+              <w:spacing w:after="0" w:line="250" w:lineRule="auto"/>
+              <w:jc w:val="left"/>
+            </w:pPr>
+            <w:r>
+              <w:rPr>
+                <w:rFonts w:ascii="Times New Roman" w:hAnsi="Times New Roman" w:eastAsia="宋体"/>
+                <w:color w:val="000000"/>
+                <w:sz w:val="20"/>
+              </w:rPr>
+              <w:t xml:space="preserve">5</w:t>
+              <w:br/>
+              <w:t xml:space="preserve">待确认</w:t>
+            </w:r>
+          </w:p>
+        </w:tc>
+        <w:tc>
+          <w:tcPr>
+            <w:tcW w:w="3510" w:type="dxa"/>
+            <w:vAlign w:val="center"/>
+            <w:tcMar>
+              <w:top w:w="65" w:type="dxa"/>
+              <w:bottom w:w="65" w:type="dxa"/>
+              <w:left w:w="80" w:type="dxa"/>
+              <w:right w:w="80" w:type="dxa"/>
+            </w:tcMar>
+          </w:tcPr>
+          <w:p>
+            <w:pPr>
+              <w:keepLines/>
+              <w:spacing w:after="0" w:line="250" w:lineRule="auto"/>
+              <w:jc w:val="left"/>
+            </w:pPr>
+            <w:r>
+              <w:rPr>
+                <w:rFonts w:ascii="Times New Roman" w:hAnsi="Times New Roman" w:eastAsia="宋体"/>
+                <w:color w:val="000000"/>
+                <w:sz w:val="20"/>
+              </w:rPr>
+              <w:t xml:space="preserve">未提供授课教师所在学院（人工智能学院）的行政负责人，无法回答[doc06][doc04]。</w:t>
+            </w:r>
+          </w:p>
+        </w:tc>
+        <w:tc>
+          <w:tcPr>
+            <w:tcW w:w="2130" w:type="dxa"/>
+            <w:vAlign w:val="center"/>
+            <w:tcMar>
+              <w:top w:w="65" w:type="dxa"/>
+              <w:bottom w:w="65" w:type="dxa"/>
+              <w:left w:w="80" w:type="dxa"/>
+              <w:right w:w="80" w:type="dxa"/>
+            </w:tcMar>
+          </w:tcPr>
+          <w:p>
+            <w:pPr>
+              <w:keepLines/>
+              <w:spacing w:after="0" w:line="250" w:lineRule="auto"/>
+              <w:jc w:val="left"/>
+            </w:pPr>
+            <w:r>
+              <w:rPr>
+                <w:rFonts w:ascii="Times New Roman" w:hAnsi="Times New Roman" w:eastAsia="宋体"/>
+                <w:color w:val="000000"/>
+                <w:sz w:val="20"/>
+              </w:rPr>
+              <w:t xml:space="preserve">AI漏拆学院事实；院长未回答</w:t>
             </w:r>
           </w:p>
         </w:tc>
@@ -8411,7 +8469,7 @@
         </w:trPr>
         <w:tc>
           <w:tcPr>
-            <w:tcW w:w="1600" w:type="dxa"/>
+            <w:tcW w:w="1430" w:type="dxa"/>
             <w:vAlign w:val="center"/>
             <w:tcMar>
               <w:top w:w="65" w:type="dxa"/>
@@ -8438,7 +8496,7 @@
         </w:tc>
         <w:tc>
           <w:tcPr>
-            <w:tcW w:w="700" w:type="dxa"/>
+            <w:tcW w:w="570" w:type="dxa"/>
             <w:vAlign w:val="center"/>
             <w:tcMar>
               <w:top w:w="65" w:type="dxa"/>
@@ -8465,82 +8523,84 @@
         </w:tc>
         <w:tc>
           <w:tcPr>
-            <w:tcW w:w="1400" w:type="dxa"/>
-            <w:vAlign w:val="center"/>
-            <w:tcMar>
-              <w:top w:w="65" w:type="dxa"/>
-              <w:bottom w:w="65" w:type="dxa"/>
-              <w:left w:w="80" w:type="dxa"/>
-              <w:right w:w="80" w:type="dxa"/>
-            </w:tcMar>
-          </w:tcPr>
-          <w:p>
-            <w:pPr>
-              <w:keepLines/>
-              <w:spacing w:after="0" w:line="250" w:lineRule="auto"/>
-              <w:jc w:val="left"/>
-            </w:pPr>
-            <w:r>
-              <w:rPr>
-                <w:rFonts w:ascii="Times New Roman" w:hAnsi="Times New Roman" w:eastAsia="宋体"/>
-                <w:color w:val="000000"/>
-                <w:sz w:val="20"/>
-              </w:rPr>
-              <w:t xml:space="preserve">5 / 待确认</w:t>
-            </w:r>
-          </w:p>
-        </w:tc>
-        <w:tc>
-          <w:tcPr>
-            <w:tcW w:w="3400" w:type="dxa"/>
-            <w:vAlign w:val="center"/>
-            <w:tcMar>
-              <w:top w:w="65" w:type="dxa"/>
-              <w:bottom w:w="65" w:type="dxa"/>
-              <w:left w:w="80" w:type="dxa"/>
-              <w:right w:w="80" w:type="dxa"/>
-            </w:tcMar>
-          </w:tcPr>
-          <w:p>
-            <w:pPr>
-              <w:keepLines/>
-              <w:spacing w:after="0" w:line="250" w:lineRule="auto"/>
-              <w:jc w:val="left"/>
-            </w:pPr>
-            <w:r>
-              <w:rPr>
-                <w:rFonts w:ascii="Times New Roman" w:hAnsi="Times New Roman" w:eastAsia="宋体"/>
-                <w:color w:val="000000"/>
-                <w:sz w:val="20"/>
-              </w:rPr>
-              <w:t xml:space="preserve">云山大学的校训是“格物致知”[doc01]。</w:t>
-            </w:r>
-          </w:p>
-        </w:tc>
-        <w:tc>
-          <w:tcPr>
-            <w:tcW w:w="1540" w:type="dxa"/>
-            <w:vAlign w:val="center"/>
-            <w:tcMar>
-              <w:top w:w="65" w:type="dxa"/>
-              <w:bottom w:w="65" w:type="dxa"/>
-              <w:left w:w="80" w:type="dxa"/>
-              <w:right w:w="80" w:type="dxa"/>
-            </w:tcMar>
-          </w:tcPr>
-          <w:p>
-            <w:pPr>
-              <w:keepLines/>
-              <w:spacing w:after="0" w:line="250" w:lineRule="auto"/>
-              <w:jc w:val="left"/>
-            </w:pPr>
-            <w:r>
-              <w:rPr>
-                <w:rFonts w:ascii="Times New Roman" w:hAnsi="Times New Roman" w:eastAsia="宋体"/>
-                <w:color w:val="000000"/>
-                <w:sz w:val="20"/>
-              </w:rPr>
-              <w:t xml:space="preserve">无；已回答</w:t>
+            <w:tcW w:w="1000" w:type="dxa"/>
+            <w:vAlign w:val="center"/>
+            <w:tcMar>
+              <w:top w:w="65" w:type="dxa"/>
+              <w:bottom w:w="65" w:type="dxa"/>
+              <w:left w:w="80" w:type="dxa"/>
+              <w:right w:w="80" w:type="dxa"/>
+            </w:tcMar>
+          </w:tcPr>
+          <w:p>
+            <w:pPr>
+              <w:keepLines/>
+              <w:spacing w:after="0" w:line="250" w:lineRule="auto"/>
+              <w:jc w:val="left"/>
+            </w:pPr>
+            <w:r>
+              <w:rPr>
+                <w:rFonts w:ascii="Times New Roman" w:hAnsi="Times New Roman" w:eastAsia="宋体"/>
+                <w:color w:val="000000"/>
+                <w:sz w:val="20"/>
+              </w:rPr>
+              <w:t xml:space="preserve">5</w:t>
+              <w:br/>
+              <w:t xml:space="preserve">待确认</w:t>
+            </w:r>
+          </w:p>
+        </w:tc>
+        <w:tc>
+          <w:tcPr>
+            <w:tcW w:w="3510" w:type="dxa"/>
+            <w:vAlign w:val="center"/>
+            <w:tcMar>
+              <w:top w:w="65" w:type="dxa"/>
+              <w:bottom w:w="65" w:type="dxa"/>
+              <w:left w:w="80" w:type="dxa"/>
+              <w:right w:w="80" w:type="dxa"/>
+            </w:tcMar>
+          </w:tcPr>
+          <w:p>
+            <w:pPr>
+              <w:keepLines/>
+              <w:spacing w:after="0" w:line="250" w:lineRule="auto"/>
+              <w:jc w:val="left"/>
+            </w:pPr>
+            <w:r>
+              <w:rPr>
+                <w:rFonts w:ascii="Times New Roman" w:hAnsi="Times New Roman" w:eastAsia="宋体"/>
+                <w:color w:val="000000"/>
+                <w:sz w:val="20"/>
+              </w:rPr>
+              <w:t xml:space="preserve">校训是「格物致知」[doc01]。</w:t>
+            </w:r>
+          </w:p>
+        </w:tc>
+        <w:tc>
+          <w:tcPr>
+            <w:tcW w:w="2130" w:type="dxa"/>
+            <w:vAlign w:val="center"/>
+            <w:tcMar>
+              <w:top w:w="65" w:type="dxa"/>
+              <w:bottom w:w="65" w:type="dxa"/>
+              <w:left w:w="80" w:type="dxa"/>
+              <w:right w:w="80" w:type="dxa"/>
+            </w:tcMar>
+          </w:tcPr>
+          <w:p>
+            <w:pPr>
+              <w:keepLines/>
+              <w:spacing w:after="0" w:line="250" w:lineRule="auto"/>
+              <w:jc w:val="left"/>
+            </w:pPr>
+            <w:r>
+              <w:rPr>
+                <w:rFonts w:ascii="Times New Roman" w:hAnsi="Times New Roman" w:eastAsia="宋体"/>
+                <w:color w:val="000000"/>
+                <w:sz w:val="20"/>
+              </w:rPr>
+              <w:t xml:space="preserve">1/1条受支持；已回答</w:t>
             </w:r>
           </w:p>
         </w:tc>
@@ -8551,7 +8611,7 @@
         </w:trPr>
         <w:tc>
           <w:tcPr>
-            <w:tcW w:w="1600" w:type="dxa"/>
+            <w:tcW w:w="1430" w:type="dxa"/>
             <w:vAlign w:val="center"/>
             <w:tcMar>
               <w:top w:w="65" w:type="dxa"/>
@@ -8578,7 +8638,7 @@
         </w:tc>
         <w:tc>
           <w:tcPr>
-            <w:tcW w:w="700" w:type="dxa"/>
+            <w:tcW w:w="570" w:type="dxa"/>
             <w:vAlign w:val="center"/>
             <w:tcMar>
               <w:top w:w="65" w:type="dxa"/>
@@ -8605,82 +8665,84 @@
         </w:tc>
         <w:tc>
           <w:tcPr>
-            <w:tcW w:w="1400" w:type="dxa"/>
-            <w:vAlign w:val="center"/>
-            <w:tcMar>
-              <w:top w:w="65" w:type="dxa"/>
-              <w:bottom w:w="65" w:type="dxa"/>
-              <w:left w:w="80" w:type="dxa"/>
-              <w:right w:w="80" w:type="dxa"/>
-            </w:tcMar>
-          </w:tcPr>
-          <w:p>
-            <w:pPr>
-              <w:keepLines/>
-              <w:spacing w:after="0" w:line="250" w:lineRule="auto"/>
-              <w:jc w:val="left"/>
-            </w:pPr>
-            <w:r>
-              <w:rPr>
-                <w:rFonts w:ascii="Times New Roman" w:hAnsi="Times New Roman" w:eastAsia="宋体"/>
-                <w:color w:val="000000"/>
-                <w:sz w:val="20"/>
-              </w:rPr>
-              <w:t xml:space="preserve">5 / 待确认</w:t>
-            </w:r>
-          </w:p>
-        </w:tc>
-        <w:tc>
-          <w:tcPr>
-            <w:tcW w:w="3400" w:type="dxa"/>
-            <w:vAlign w:val="center"/>
-            <w:tcMar>
-              <w:top w:w="65" w:type="dxa"/>
-              <w:bottom w:w="65" w:type="dxa"/>
-              <w:left w:w="80" w:type="dxa"/>
-              <w:right w:w="80" w:type="dxa"/>
-            </w:tcMar>
-          </w:tcPr>
-          <w:p>
-            <w:pPr>
-              <w:keepLines/>
-              <w:spacing w:after="0" w:line="250" w:lineRule="auto"/>
-              <w:jc w:val="left"/>
-            </w:pPr>
-            <w:r>
-              <w:rPr>
-                <w:rFonts w:ascii="Times New Roman" w:hAnsi="Times New Roman" w:eastAsia="宋体"/>
-                <w:color w:val="000000"/>
-                <w:sz w:val="20"/>
-              </w:rPr>
-              <w:t xml:space="preserve">本次检索上下文没有科研平台与建设依托关系的资料，无法据此列出完整答案。</w:t>
-            </w:r>
-          </w:p>
-        </w:tc>
-        <w:tc>
-          <w:tcPr>
-            <w:tcW w:w="1540" w:type="dxa"/>
-            <w:vAlign w:val="center"/>
-            <w:tcMar>
-              <w:top w:w="65" w:type="dxa"/>
-              <w:bottom w:w="65" w:type="dxa"/>
-              <w:left w:w="80" w:type="dxa"/>
-              <w:right w:w="80" w:type="dxa"/>
-            </w:tcMar>
-          </w:tcPr>
-          <w:p>
-            <w:pPr>
-              <w:keepLines/>
-              <w:spacing w:after="0" w:line="250" w:lineRule="auto"/>
-              <w:jc w:val="left"/>
-            </w:pPr>
-            <w:r>
-              <w:rPr>
-                <w:rFonts w:ascii="Times New Roman" w:hAnsi="Times New Roman" w:eastAsia="宋体"/>
-                <w:color w:val="000000"/>
-                <w:sz w:val="20"/>
-              </w:rPr>
-              <w:t xml:space="preserve">无；部分回答或拒答</w:t>
+            <w:tcW w:w="1000" w:type="dxa"/>
+            <w:vAlign w:val="center"/>
+            <w:tcMar>
+              <w:top w:w="65" w:type="dxa"/>
+              <w:bottom w:w="65" w:type="dxa"/>
+              <w:left w:w="80" w:type="dxa"/>
+              <w:right w:w="80" w:type="dxa"/>
+            </w:tcMar>
+          </w:tcPr>
+          <w:p>
+            <w:pPr>
+              <w:keepLines/>
+              <w:spacing w:after="0" w:line="250" w:lineRule="auto"/>
+              <w:jc w:val="left"/>
+            </w:pPr>
+            <w:r>
+              <w:rPr>
+                <w:rFonts w:ascii="Times New Roman" w:hAnsi="Times New Roman" w:eastAsia="宋体"/>
+                <w:color w:val="000000"/>
+                <w:sz w:val="20"/>
+              </w:rPr>
+              <w:t xml:space="preserve">5</w:t>
+              <w:br/>
+              <w:t xml:space="preserve">待确认</w:t>
+            </w:r>
+          </w:p>
+        </w:tc>
+        <w:tc>
+          <w:tcPr>
+            <w:tcW w:w="3510" w:type="dxa"/>
+            <w:vAlign w:val="center"/>
+            <w:tcMar>
+              <w:top w:w="65" w:type="dxa"/>
+              <w:bottom w:w="65" w:type="dxa"/>
+              <w:left w:w="80" w:type="dxa"/>
+              <w:right w:w="80" w:type="dxa"/>
+            </w:tcMar>
+          </w:tcPr>
+          <w:p>
+            <w:pPr>
+              <w:keepLines/>
+              <w:spacing w:after="0" w:line="250" w:lineRule="auto"/>
+              <w:jc w:val="left"/>
+            </w:pPr>
+            <w:r>
+              <w:rPr>
+                <w:rFonts w:ascii="Times New Roman" w:hAnsi="Times New Roman" w:eastAsia="宋体"/>
+                <w:color w:val="000000"/>
+                <w:sz w:val="20"/>
+              </w:rPr>
+              <w:t xml:space="preserve">资料中没有科研平台及其依托单位信息，无法回答[doc01][doc04][doc11][doc12][doc14]。</w:t>
+            </w:r>
+          </w:p>
+        </w:tc>
+        <w:tc>
+          <w:tcPr>
+            <w:tcW w:w="2130" w:type="dxa"/>
+            <w:vAlign w:val="center"/>
+            <w:tcMar>
+              <w:top w:w="65" w:type="dxa"/>
+              <w:bottom w:w="65" w:type="dxa"/>
+              <w:left w:w="80" w:type="dxa"/>
+              <w:right w:w="80" w:type="dxa"/>
+            </w:tcMar>
+          </w:tcPr>
+          <w:p>
+            <w:pPr>
+              <w:keepLines/>
+              <w:spacing w:after="0" w:line="250" w:lineRule="auto"/>
+              <w:jc w:val="left"/>
+            </w:pPr>
+            <w:r>
+              <w:rPr>
+                <w:rFonts w:ascii="Times New Roman" w:hAnsi="Times New Roman" w:eastAsia="宋体"/>
+                <w:color w:val="000000"/>
+                <w:sz w:val="20"/>
+              </w:rPr>
+              <w:t xml:space="preserve">AI拆分0条；拒答</w:t>
             </w:r>
           </w:p>
         </w:tc>
@@ -8713,7 +8775,7 @@
           <w:color w:val="000000"/>
           <w:sz w:val="22"/>
         </w:rPr>
-        <w:t xml:space="preserve">量表：5=断言均受支持或谨慎拒答；4=个别边界含糊；3=部分无依据；2=多项无依据；1=主要内容无依据。九例未编造，初评均5，不代表答题能力相同。</w:t>
+        <w:t xml:space="preserve">量表：5=事实受支持或谨慎拒答，4=边界含糊，3=部分无依据，2=多项无依据，1=主要无依据。九例AI初评均5；引文均能在对应原文中找到，但引文匹配不等于逻辑支持，且高分不等于答案完整。</w:t>
       </w:r>
     </w:p>
     <w:p>
@@ -8728,7 +8790,7 @@
           <w:color w:val="000000"/>
           <w:sz w:val="22"/>
         </w:rPr>
-        <w:t xml:space="preserve">Graph/Wiki的Q11缺平台资料而拒答，Wiki的Q01缺院长资料而部分回答。无事实声明时式8-8分母为0，比例不定义；拒答5分只表示未编造，不当作答题成功，不计算平均忠实度。人工须逐例确认或修改分数。</w:t>
+        <w:t xml:space="preserve">Graph/Wiki Q11拒答，无事实声明时支持比例分母为0，不定义。Wiki Q01虽然拒答，却在括号中断言学院为人工智能学院；同模型评审错误地给出claims=[]，审计指出漏拆，应人工补核该受支持事实。保留原始AI响应，不以修饰后的输出掩盖误判；本次未计算平均忠实度，也未运行RAGAS。</w:t>
       </w:r>
     </w:p>
     <w:p>
@@ -10629,6 +10691,1412 @@
           <w:color w:val="000000"/>
           <w:sz w:val="24"/>
         </w:rPr>
+        <w:t xml:space="preserve">5.1.2  现场API构建与复测</w:t>
+      </w:r>
+    </w:p>
+    <w:p>
+      <w:pPr>
+        <w:keepLines/>
+        <w:spacing w:after="90" w:line="280" w:lineRule="auto"/>
+        <w:jc w:val="left"/>
+      </w:pPr>
+      <w:r>
+        <w:rPr>
+          <w:rFonts w:ascii="Times New Roman" w:hAnsi="Times New Roman" w:eastAsia="宋体"/>
+          <w:color w:val="000000"/>
+          <w:sz w:val="22"/>
+        </w:rPr>
+        <w:t xml:space="preserve">同一15篇原文、同一BGE版本、同一20题与文档K=5。v2先现场抽取，头尾去空格和书名号归一并保留来源；检测14社区，再按内部边及原文生成14段摘要。九个Wiki条目正文重新聚合。表7a展示新知识库，参考表3/3a原始数据完整保留。</w:t>
+      </w:r>
+    </w:p>
+    <w:p>
+      <w:pPr>
+        <w:keepLines/>
+        <w:spacing w:after="90" w:line="280" w:lineRule="auto"/>
+        <w:jc w:val="left"/>
+      </w:pPr>
+      <w:r>
+        <w:rPr>
+          <w:rFonts w:ascii="Times New Roman" w:hAnsi="Times New Roman" w:eastAsia="宋体"/>
+          <w:color w:val="000000"/>
+          <w:sz w:val="22"/>
+        </w:rPr>
+        <w:t xml:space="preserve">官方API为https://api.deepseek.com/chat/completions；请求与响应模型均deepseek-flash。[5] 共61次调用：9答案、3次v1/15次v2抽取、14摘要、9条目、2现场Q11及9评审。输入15088、输出3768、共18856 token。整段24.94秒，最多三请求并行；单调用耗时之和47.20秒不等于运行总耗时，也不计入表6。密钥只用于进程环境，不保存于代码或结果。</w:t>
+      </w:r>
+    </w:p>
+    <w:p>
+      <w:pPr>
+        <w:keepNext/>
+        <w:keepLines/>
+        <w:spacing w:after="90" w:line="280" w:lineRule="auto"/>
+        <w:jc w:val="center"/>
+      </w:pPr>
+      <w:r>
+        <w:rPr>
+          <w:rFonts w:ascii="Times New Roman" w:hAnsi="Times New Roman" w:eastAsia="宋体"/>
+          <w:b/>
+          <w:color w:val="000000"/>
+          <w:sz w:val="21"/>
+        </w:rPr>
+        <w:t xml:space="preserve">表 7a  实际API构建后的20题评测</w:t>
+      </w:r>
+    </w:p>
+    <w:tbl>
+      <w:tblPr>
+        <w:tblStyle w:val="TableGrid"/>
+        <w:tblW w:w="8640" w:type="dxa"/>
+        <w:tblLook w:firstColumn="1" w:firstRow="1" w:lastColumn="0" w:lastRow="0" w:noHBand="0" w:noVBand="1" w:val="04A0"/>
+        <w:tblLayout w:type="fixed"/>
+      </w:tblPr>
+      <w:tblGrid>
+        <w:gridCol w:w="2760"/>
+        <w:gridCol w:w="1600"/>
+        <w:gridCol w:w="1600"/>
+        <w:gridCol w:w="2680"/>
+      </w:tblGrid>
+      <w:tr>
+        <w:trPr>
+          <w:cantSplit/>
+          <w:tblHeader/>
+        </w:trPr>
+        <w:tc>
+          <w:tcPr>
+            <w:tcW w:w="2760" w:type="dxa"/>
+            <w:vAlign w:val="center"/>
+            <w:tcMar>
+              <w:top w:w="65" w:type="dxa"/>
+              <w:bottom w:w="65" w:type="dxa"/>
+              <w:left w:w="80" w:type="dxa"/>
+              <w:right w:w="80" w:type="dxa"/>
+            </w:tcMar>
+          </w:tcPr>
+          <w:p>
+            <w:pPr>
+              <w:keepLines/>
+              <w:spacing w:after="0" w:line="250" w:lineRule="auto"/>
+              <w:jc w:val="center"/>
+            </w:pPr>
+            <w:r>
+              <w:rPr>
+                <w:rFonts w:ascii="Times New Roman" w:hAnsi="Times New Roman" w:eastAsia="宋体"/>
+                <w:b/>
+                <w:color w:val="000000"/>
+                <w:sz w:val="20"/>
+              </w:rPr>
+              <w:t xml:space="preserve">现场方案</w:t>
+            </w:r>
+          </w:p>
+        </w:tc>
+        <w:tc>
+          <w:tcPr>
+            <w:tcW w:w="1600" w:type="dxa"/>
+            <w:vAlign w:val="center"/>
+            <w:tcMar>
+              <w:top w:w="65" w:type="dxa"/>
+              <w:bottom w:w="65" w:type="dxa"/>
+              <w:left w:w="80" w:type="dxa"/>
+              <w:right w:w="80" w:type="dxa"/>
+            </w:tcMar>
+          </w:tcPr>
+          <w:p>
+            <w:pPr>
+              <w:keepLines/>
+              <w:spacing w:after="0" w:line="250" w:lineRule="auto"/>
+              <w:jc w:val="center"/>
+            </w:pPr>
+            <w:r>
+              <w:rPr>
+                <w:rFonts w:ascii="Times New Roman" w:hAnsi="Times New Roman" w:eastAsia="宋体"/>
+                <w:b/>
+                <w:color w:val="000000"/>
+                <w:sz w:val="20"/>
+              </w:rPr>
+              <w:t xml:space="preserve">Recall@5</w:t>
+            </w:r>
+          </w:p>
+        </w:tc>
+        <w:tc>
+          <w:tcPr>
+            <w:tcW w:w="1600" w:type="dxa"/>
+            <w:vAlign w:val="center"/>
+            <w:tcMar>
+              <w:top w:w="65" w:type="dxa"/>
+              <w:bottom w:w="65" w:type="dxa"/>
+              <w:left w:w="80" w:type="dxa"/>
+              <w:right w:w="80" w:type="dxa"/>
+            </w:tcMar>
+          </w:tcPr>
+          <w:p>
+            <w:pPr>
+              <w:keepLines/>
+              <w:spacing w:after="0" w:line="250" w:lineRule="auto"/>
+              <w:jc w:val="center"/>
+            </w:pPr>
+            <w:r>
+              <w:rPr>
+                <w:rFonts w:ascii="Times New Roman" w:hAnsi="Times New Roman" w:eastAsia="宋体"/>
+                <w:b/>
+                <w:color w:val="000000"/>
+                <w:sz w:val="20"/>
+              </w:rPr>
+              <w:t xml:space="preserve">MRR</w:t>
+            </w:r>
+          </w:p>
+        </w:tc>
+        <w:tc>
+          <w:tcPr>
+            <w:tcW w:w="2680" w:type="dxa"/>
+            <w:vAlign w:val="center"/>
+            <w:tcMar>
+              <w:top w:w="65" w:type="dxa"/>
+              <w:bottom w:w="65" w:type="dxa"/>
+              <w:left w:w="80" w:type="dxa"/>
+              <w:right w:w="80" w:type="dxa"/>
+            </w:tcMar>
+          </w:tcPr>
+          <w:p>
+            <w:pPr>
+              <w:keepLines/>
+              <w:spacing w:after="0" w:line="250" w:lineRule="auto"/>
+              <w:jc w:val="center"/>
+            </w:pPr>
+            <w:r>
+              <w:rPr>
+                <w:rFonts w:ascii="Times New Roman" w:hAnsi="Times New Roman" w:eastAsia="宋体"/>
+                <w:b/>
+                <w:color w:val="000000"/>
+                <w:sz w:val="20"/>
+              </w:rPr>
+              <w:t xml:space="preserve">全证据命中</w:t>
+            </w:r>
+          </w:p>
+        </w:tc>
+      </w:tr>
+      <w:tr>
+        <w:trPr>
+          <w:cantSplit/>
+        </w:trPr>
+        <w:tc>
+          <w:tcPr>
+            <w:tcW w:w="2760" w:type="dxa"/>
+            <w:vAlign w:val="center"/>
+            <w:tcMar>
+              <w:top w:w="65" w:type="dxa"/>
+              <w:bottom w:w="65" w:type="dxa"/>
+              <w:left w:w="80" w:type="dxa"/>
+              <w:right w:w="80" w:type="dxa"/>
+            </w:tcMar>
+          </w:tcPr>
+          <w:p>
+            <w:pPr>
+              <w:keepLines/>
+              <w:spacing w:after="0" w:line="250" w:lineRule="auto"/>
+              <w:jc w:val="left"/>
+            </w:pPr>
+            <w:r>
+              <w:rPr>
+                <w:rFonts w:ascii="Times New Roman" w:hAnsi="Times New Roman" w:eastAsia="宋体"/>
+                <w:color w:val="000000"/>
+                <w:sz w:val="20"/>
+              </w:rPr>
+              <w:t xml:space="preserve">Vector 原文基线</w:t>
+            </w:r>
+          </w:p>
+        </w:tc>
+        <w:tc>
+          <w:tcPr>
+            <w:tcW w:w="1600" w:type="dxa"/>
+            <w:vAlign w:val="center"/>
+            <w:tcMar>
+              <w:top w:w="65" w:type="dxa"/>
+              <w:bottom w:w="65" w:type="dxa"/>
+              <w:left w:w="80" w:type="dxa"/>
+              <w:right w:w="80" w:type="dxa"/>
+            </w:tcMar>
+          </w:tcPr>
+          <w:p>
+            <w:pPr>
+              <w:keepLines/>
+              <w:spacing w:after="0" w:line="250" w:lineRule="auto"/>
+              <w:jc w:val="left"/>
+            </w:pPr>
+            <w:r>
+              <w:rPr>
+                <w:rFonts w:ascii="Times New Roman" w:hAnsi="Times New Roman" w:eastAsia="宋体"/>
+                <w:color w:val="000000"/>
+                <w:sz w:val="20"/>
+              </w:rPr>
+              <w:t xml:space="preserve">0.9667</w:t>
+            </w:r>
+          </w:p>
+        </w:tc>
+        <w:tc>
+          <w:tcPr>
+            <w:tcW w:w="1600" w:type="dxa"/>
+            <w:vAlign w:val="center"/>
+            <w:tcMar>
+              <w:top w:w="65" w:type="dxa"/>
+              <w:bottom w:w="65" w:type="dxa"/>
+              <w:left w:w="80" w:type="dxa"/>
+              <w:right w:w="80" w:type="dxa"/>
+            </w:tcMar>
+          </w:tcPr>
+          <w:p>
+            <w:pPr>
+              <w:keepLines/>
+              <w:spacing w:after="0" w:line="250" w:lineRule="auto"/>
+              <w:jc w:val="left"/>
+            </w:pPr>
+            <w:r>
+              <w:rPr>
+                <w:rFonts w:ascii="Times New Roman" w:hAnsi="Times New Roman" w:eastAsia="宋体"/>
+                <w:color w:val="000000"/>
+                <w:sz w:val="20"/>
+              </w:rPr>
+              <w:t xml:space="preserve">1.0000</w:t>
+            </w:r>
+          </w:p>
+        </w:tc>
+        <w:tc>
+          <w:tcPr>
+            <w:tcW w:w="2680" w:type="dxa"/>
+            <w:vAlign w:val="center"/>
+            <w:tcMar>
+              <w:top w:w="65" w:type="dxa"/>
+              <w:bottom w:w="65" w:type="dxa"/>
+              <w:left w:w="80" w:type="dxa"/>
+              <w:right w:w="80" w:type="dxa"/>
+            </w:tcMar>
+          </w:tcPr>
+          <w:p>
+            <w:pPr>
+              <w:keepLines/>
+              <w:spacing w:after="0" w:line="250" w:lineRule="auto"/>
+              <w:jc w:val="left"/>
+            </w:pPr>
+            <w:r>
+              <w:rPr>
+                <w:rFonts w:ascii="Times New Roman" w:hAnsi="Times New Roman" w:eastAsia="宋体"/>
+                <w:color w:val="000000"/>
+                <w:sz w:val="20"/>
+              </w:rPr>
+              <w:t xml:space="preserve">19/20</w:t>
+            </w:r>
+          </w:p>
+        </w:tc>
+      </w:tr>
+      <w:tr>
+        <w:trPr>
+          <w:cantSplit/>
+        </w:trPr>
+        <w:tc>
+          <w:tcPr>
+            <w:tcW w:w="2760" w:type="dxa"/>
+            <w:vAlign w:val="center"/>
+            <w:tcMar>
+              <w:top w:w="65" w:type="dxa"/>
+              <w:bottom w:w="65" w:type="dxa"/>
+              <w:left w:w="80" w:type="dxa"/>
+              <w:right w:w="80" w:type="dxa"/>
+            </w:tcMar>
+          </w:tcPr>
+          <w:p>
+            <w:pPr>
+              <w:keepLines/>
+              <w:spacing w:after="0" w:line="250" w:lineRule="auto"/>
+              <w:jc w:val="left"/>
+            </w:pPr>
+            <w:r>
+              <w:rPr>
+                <w:rFonts w:ascii="Times New Roman" w:hAnsi="Times New Roman" w:eastAsia="宋体"/>
+                <w:color w:val="000000"/>
+                <w:sz w:val="20"/>
+              </w:rPr>
+              <w:t xml:space="preserve">Graph Local</w:t>
+            </w:r>
+          </w:p>
+        </w:tc>
+        <w:tc>
+          <w:tcPr>
+            <w:tcW w:w="1600" w:type="dxa"/>
+            <w:vAlign w:val="center"/>
+            <w:tcMar>
+              <w:top w:w="65" w:type="dxa"/>
+              <w:bottom w:w="65" w:type="dxa"/>
+              <w:left w:w="80" w:type="dxa"/>
+              <w:right w:w="80" w:type="dxa"/>
+            </w:tcMar>
+          </w:tcPr>
+          <w:p>
+            <w:pPr>
+              <w:keepLines/>
+              <w:spacing w:after="0" w:line="250" w:lineRule="auto"/>
+              <w:jc w:val="left"/>
+            </w:pPr>
+            <w:r>
+              <w:rPr>
+                <w:rFonts w:ascii="Times New Roman" w:hAnsi="Times New Roman" w:eastAsia="宋体"/>
+                <w:color w:val="000000"/>
+                <w:sz w:val="20"/>
+              </w:rPr>
+              <w:t xml:space="preserve">0.8333</w:t>
+            </w:r>
+          </w:p>
+        </w:tc>
+        <w:tc>
+          <w:tcPr>
+            <w:tcW w:w="1600" w:type="dxa"/>
+            <w:vAlign w:val="center"/>
+            <w:tcMar>
+              <w:top w:w="65" w:type="dxa"/>
+              <w:bottom w:w="65" w:type="dxa"/>
+              <w:left w:w="80" w:type="dxa"/>
+              <w:right w:w="80" w:type="dxa"/>
+            </w:tcMar>
+          </w:tcPr>
+          <w:p>
+            <w:pPr>
+              <w:keepLines/>
+              <w:spacing w:after="0" w:line="250" w:lineRule="auto"/>
+              <w:jc w:val="left"/>
+            </w:pPr>
+            <w:r>
+              <w:rPr>
+                <w:rFonts w:ascii="Times New Roman" w:hAnsi="Times New Roman" w:eastAsia="宋体"/>
+                <w:color w:val="000000"/>
+                <w:sz w:val="20"/>
+              </w:rPr>
+              <w:t xml:space="preserve">0.8167</w:t>
+            </w:r>
+          </w:p>
+        </w:tc>
+        <w:tc>
+          <w:tcPr>
+            <w:tcW w:w="2680" w:type="dxa"/>
+            <w:vAlign w:val="center"/>
+            <w:tcMar>
+              <w:top w:w="65" w:type="dxa"/>
+              <w:bottom w:w="65" w:type="dxa"/>
+              <w:left w:w="80" w:type="dxa"/>
+              <w:right w:w="80" w:type="dxa"/>
+            </w:tcMar>
+          </w:tcPr>
+          <w:p>
+            <w:pPr>
+              <w:keepLines/>
+              <w:spacing w:after="0" w:line="250" w:lineRule="auto"/>
+              <w:jc w:val="left"/>
+            </w:pPr>
+            <w:r>
+              <w:rPr>
+                <w:rFonts w:ascii="Times New Roman" w:hAnsi="Times New Roman" w:eastAsia="宋体"/>
+                <w:color w:val="000000"/>
+                <w:sz w:val="20"/>
+              </w:rPr>
+              <w:t xml:space="preserve">15/20</w:t>
+            </w:r>
+          </w:p>
+        </w:tc>
+      </w:tr>
+      <w:tr>
+        <w:trPr>
+          <w:cantSplit/>
+        </w:trPr>
+        <w:tc>
+          <w:tcPr>
+            <w:tcW w:w="2760" w:type="dxa"/>
+            <w:vAlign w:val="center"/>
+            <w:tcMar>
+              <w:top w:w="65" w:type="dxa"/>
+              <w:bottom w:w="65" w:type="dxa"/>
+              <w:left w:w="80" w:type="dxa"/>
+              <w:right w:w="80" w:type="dxa"/>
+            </w:tcMar>
+          </w:tcPr>
+          <w:p>
+            <w:pPr>
+              <w:keepLines/>
+              <w:spacing w:after="0" w:line="250" w:lineRule="auto"/>
+              <w:jc w:val="left"/>
+            </w:pPr>
+            <w:r>
+              <w:rPr>
+                <w:rFonts w:ascii="Times New Roman" w:hAnsi="Times New Roman" w:eastAsia="宋体"/>
+                <w:color w:val="000000"/>
+                <w:sz w:val="20"/>
+              </w:rPr>
+              <w:t xml:space="preserve">Graph Global</w:t>
+            </w:r>
+          </w:p>
+        </w:tc>
+        <w:tc>
+          <w:tcPr>
+            <w:tcW w:w="1600" w:type="dxa"/>
+            <w:vAlign w:val="center"/>
+            <w:tcMar>
+              <w:top w:w="65" w:type="dxa"/>
+              <w:bottom w:w="65" w:type="dxa"/>
+              <w:left w:w="80" w:type="dxa"/>
+              <w:right w:w="80" w:type="dxa"/>
+            </w:tcMar>
+          </w:tcPr>
+          <w:p>
+            <w:pPr>
+              <w:keepLines/>
+              <w:spacing w:after="0" w:line="250" w:lineRule="auto"/>
+              <w:jc w:val="left"/>
+            </w:pPr>
+            <w:r>
+              <w:rPr>
+                <w:rFonts w:ascii="Times New Roman" w:hAnsi="Times New Roman" w:eastAsia="宋体"/>
+                <w:color w:val="000000"/>
+                <w:sz w:val="20"/>
+              </w:rPr>
+              <w:t xml:space="preserve">0.9000</w:t>
+            </w:r>
+          </w:p>
+        </w:tc>
+        <w:tc>
+          <w:tcPr>
+            <w:tcW w:w="1600" w:type="dxa"/>
+            <w:vAlign w:val="center"/>
+            <w:tcMar>
+              <w:top w:w="65" w:type="dxa"/>
+              <w:bottom w:w="65" w:type="dxa"/>
+              <w:left w:w="80" w:type="dxa"/>
+              <w:right w:w="80" w:type="dxa"/>
+            </w:tcMar>
+          </w:tcPr>
+          <w:p>
+            <w:pPr>
+              <w:keepLines/>
+              <w:spacing w:after="0" w:line="250" w:lineRule="auto"/>
+              <w:jc w:val="left"/>
+            </w:pPr>
+            <w:r>
+              <w:rPr>
+                <w:rFonts w:ascii="Times New Roman" w:hAnsi="Times New Roman" w:eastAsia="宋体"/>
+                <w:color w:val="000000"/>
+                <w:sz w:val="20"/>
+              </w:rPr>
+              <w:t xml:space="preserve">0.8375</w:t>
+            </w:r>
+          </w:p>
+        </w:tc>
+        <w:tc>
+          <w:tcPr>
+            <w:tcW w:w="2680" w:type="dxa"/>
+            <w:vAlign w:val="center"/>
+            <w:tcMar>
+              <w:top w:w="65" w:type="dxa"/>
+              <w:bottom w:w="65" w:type="dxa"/>
+              <w:left w:w="80" w:type="dxa"/>
+              <w:right w:w="80" w:type="dxa"/>
+            </w:tcMar>
+          </w:tcPr>
+          <w:p>
+            <w:pPr>
+              <w:keepLines/>
+              <w:spacing w:after="0" w:line="250" w:lineRule="auto"/>
+              <w:jc w:val="left"/>
+            </w:pPr>
+            <w:r>
+              <w:rPr>
+                <w:rFonts w:ascii="Times New Roman" w:hAnsi="Times New Roman" w:eastAsia="宋体"/>
+                <w:color w:val="000000"/>
+                <w:sz w:val="20"/>
+              </w:rPr>
+              <w:t xml:space="preserve">16/20</w:t>
+            </w:r>
+          </w:p>
+        </w:tc>
+      </w:tr>
+      <w:tr>
+        <w:trPr>
+          <w:cantSplit/>
+        </w:trPr>
+        <w:tc>
+          <w:tcPr>
+            <w:tcW w:w="2760" w:type="dxa"/>
+            <w:vAlign w:val="center"/>
+            <w:tcMar>
+              <w:top w:w="65" w:type="dxa"/>
+              <w:bottom w:w="65" w:type="dxa"/>
+              <w:left w:w="80" w:type="dxa"/>
+              <w:right w:w="80" w:type="dxa"/>
+            </w:tcMar>
+          </w:tcPr>
+          <w:p>
+            <w:pPr>
+              <w:keepLines/>
+              <w:spacing w:after="0" w:line="250" w:lineRule="auto"/>
+              <w:jc w:val="left"/>
+            </w:pPr>
+            <w:r>
+              <w:rPr>
+                <w:rFonts w:ascii="Times New Roman" w:hAnsi="Times New Roman" w:eastAsia="宋体"/>
+                <w:color w:val="000000"/>
+                <w:sz w:val="20"/>
+              </w:rPr>
+              <w:t xml:space="preserve">Wiki</w:t>
+            </w:r>
+          </w:p>
+        </w:tc>
+        <w:tc>
+          <w:tcPr>
+            <w:tcW w:w="1600" w:type="dxa"/>
+            <w:vAlign w:val="center"/>
+            <w:tcMar>
+              <w:top w:w="65" w:type="dxa"/>
+              <w:bottom w:w="65" w:type="dxa"/>
+              <w:left w:w="80" w:type="dxa"/>
+              <w:right w:w="80" w:type="dxa"/>
+            </w:tcMar>
+          </w:tcPr>
+          <w:p>
+            <w:pPr>
+              <w:keepLines/>
+              <w:spacing w:after="0" w:line="250" w:lineRule="auto"/>
+              <w:jc w:val="left"/>
+            </w:pPr>
+            <w:r>
+              <w:rPr>
+                <w:rFonts w:ascii="Times New Roman" w:hAnsi="Times New Roman" w:eastAsia="宋体"/>
+                <w:color w:val="000000"/>
+                <w:sz w:val="20"/>
+              </w:rPr>
+              <w:t xml:space="preserve">0.9083</w:t>
+            </w:r>
+          </w:p>
+        </w:tc>
+        <w:tc>
+          <w:tcPr>
+            <w:tcW w:w="1600" w:type="dxa"/>
+            <w:vAlign w:val="center"/>
+            <w:tcMar>
+              <w:top w:w="65" w:type="dxa"/>
+              <w:bottom w:w="65" w:type="dxa"/>
+              <w:left w:w="80" w:type="dxa"/>
+              <w:right w:w="80" w:type="dxa"/>
+            </w:tcMar>
+          </w:tcPr>
+          <w:p>
+            <w:pPr>
+              <w:keepLines/>
+              <w:spacing w:after="0" w:line="250" w:lineRule="auto"/>
+              <w:jc w:val="left"/>
+            </w:pPr>
+            <w:r>
+              <w:rPr>
+                <w:rFonts w:ascii="Times New Roman" w:hAnsi="Times New Roman" w:eastAsia="宋体"/>
+                <w:color w:val="000000"/>
+                <w:sz w:val="20"/>
+              </w:rPr>
+              <w:t xml:space="preserve">0.7792</w:t>
+            </w:r>
+          </w:p>
+        </w:tc>
+        <w:tc>
+          <w:tcPr>
+            <w:tcW w:w="2680" w:type="dxa"/>
+            <w:vAlign w:val="center"/>
+            <w:tcMar>
+              <w:top w:w="65" w:type="dxa"/>
+              <w:bottom w:w="65" w:type="dxa"/>
+              <w:left w:w="80" w:type="dxa"/>
+              <w:right w:w="80" w:type="dxa"/>
+            </w:tcMar>
+          </w:tcPr>
+          <w:p>
+            <w:pPr>
+              <w:keepLines/>
+              <w:spacing w:after="0" w:line="250" w:lineRule="auto"/>
+              <w:jc w:val="left"/>
+            </w:pPr>
+            <w:r>
+              <w:rPr>
+                <w:rFonts w:ascii="Times New Roman" w:hAnsi="Times New Roman" w:eastAsia="宋体"/>
+                <w:color w:val="000000"/>
+                <w:sz w:val="20"/>
+              </w:rPr>
+              <w:t xml:space="preserve">15/20</w:t>
+            </w:r>
+          </w:p>
+        </w:tc>
+      </w:tr>
+    </w:tbl>
+    <w:p>
+      <w:pPr>
+        <w:keepLines/>
+        <w:spacing w:after="50" w:line="40" w:lineRule="auto"/>
+        <w:jc w:val="left"/>
+      </w:pPr>
+      <w:r>
+        <w:rPr>
+          <w:rFonts w:ascii="Times New Roman" w:hAnsi="Times New Roman" w:eastAsia="宋体"/>
+          <w:color w:val="000000"/>
+          <w:sz w:val="2"/>
+        </w:rPr>
+        <w:t xml:space="preserve"/>
+      </w:r>
+    </w:p>
+    <w:p>
+      <w:pPr>
+        <w:keepLines/>
+        <w:spacing w:after="90" w:line="280" w:lineRule="auto"/>
+        <w:jc w:val="left"/>
+      </w:pPr>
+      <w:r>
+        <w:rPr>
+          <w:rFonts w:ascii="Times New Roman" w:hAnsi="Times New Roman" w:eastAsia="宋体"/>
+          <w:color w:val="000000"/>
+          <w:sz w:val="22"/>
+        </w:rPr>
+        <w:t xml:space="preserve">参考→现场：Graph Local Recall 0.8083→0.8333，MRR 0.7392→0.8167；Global Recall 0.7167→0.9000，MRR 0.5808→0.8375；Wiki Recall 0.8583→0.9083，MRR 0.7500→0.7792，但全证据命中16→15题。宏平均Recall提高并不保证每题更好。Vector仍为0.9667/1.0000、19/20，现场图谱仍未全面超过向量。</w:t>
+      </w:r>
+    </w:p>
+    <w:p>
+      <w:pPr>
+        <w:keepLines/>
+        <w:spacing w:after="90" w:line="280" w:lineRule="auto"/>
+        <w:jc w:val="left"/>
+      </w:pPr>
+      <w:r>
+        <w:rPr>
+          <w:rFonts w:ascii="Times New Roman" w:hAnsi="Times New Roman" w:eastAsia="宋体"/>
+          <w:color w:val="000000"/>
+          <w:sz w:val="22"/>
+        </w:rPr>
+        <w:t xml:space="preserve">现场图谱同时改变三元组覆盖、表述、实体归一与摘要来源，不能把差异归因于单一提示词，也不是模型能力的控制变量实验。Global的全局题Recall/MRR为0.7619/0.7143；Local为0.5238/0.4762，后者低于参考Local全局Recall 0.6429。</w:t>
+      </w:r>
+    </w:p>
+    <w:p>
+      <w:pPr>
+        <w:keepLines/>
+        <w:spacing w:after="90" w:line="280" w:lineRule="auto"/>
+        <w:jc w:val="left"/>
+      </w:pPr>
+      <w:r>
+        <w:rPr>
+          <w:rFonts w:ascii="Times New Roman" w:hAnsi="Times New Roman" w:eastAsia="宋体"/>
+          <w:color w:val="000000"/>
+          <w:sz w:val="22"/>
+        </w:rPr>
+        <w:t xml:space="preserve">Q11现场Graph Global返回doc01/doc10/doc09，Wiki返回doc01/doc12/doc14/doc03/doc10，gold覆盖分别1/3和2/3。两份现场答案都正确给出两平台及管理关系，因为doc10已含主要事实；覆盖指标与答题完整性需分别核查。九例评分仍针对参考基线的上下文，不能移作现场全题生成成绩。</w:t>
+      </w:r>
+    </w:p>
+    <w:p>
+      <w:pPr>
+        <w:keepNext/>
+        <w:keepLines/>
+        <w:pageBreakBefore/>
+        <w:spacing w:before="160" w:after="80" w:line="276" w:lineRule="auto"/>
+      </w:pPr>
+      <w:r>
+        <w:rPr>
+          <w:rFonts w:ascii="Arial" w:hAnsi="Arial" w:eastAsia="黑体"/>
+          <w:b/>
+          <w:color w:val="000000"/>
+          <w:sz w:val="24"/>
+        </w:rPr>
+        <w:t xml:space="preserve">5.1.3  抽取提示词对照与生成错误</w:t>
+      </w:r>
+    </w:p>
+    <w:p>
+      <w:pPr>
+        <w:keepLines/>
+        <w:spacing w:after="90" w:line="280" w:lineRule="auto"/>
+        <w:jc w:val="left"/>
+      </w:pPr>
+      <w:r>
+        <w:rPr>
+          <w:rFonts w:ascii="Times New Roman" w:hAnsi="Times New Roman" w:eastAsia="宋体"/>
+          <w:color w:val="000000"/>
+          <w:sz w:val="22"/>
+        </w:rPr>
+        <w:t xml:space="preserve">v1只要求头实体、关系、尾实体和JSON；v2增加只抽原文、不补人数年份教材、区分共建与管理、全称与关系方向等约束。两版预先定义，v1在doc04/doc10/doc15调用3次，v2在全15篇调用15次；比较样本只有三个共同文档，不能声称根据本次v1输出又迭代优化了v2。</w:t>
+      </w:r>
+    </w:p>
+    <w:p>
+      <w:pPr>
+        <w:keepNext/>
+        <w:keepLines/>
+        <w:spacing w:after="90" w:line="280" w:lineRule="auto"/>
+        <w:jc w:val="center"/>
+      </w:pPr>
+      <w:r>
+        <w:rPr>
+          <w:rFonts w:ascii="Times New Roman" w:hAnsi="Times New Roman" w:eastAsia="宋体"/>
+          <w:b/>
+          <w:color w:val="000000"/>
+          <w:sz w:val="21"/>
+        </w:rPr>
+        <w:t xml:space="preserve">表 7b  现场知识的原文审计</w:t>
+      </w:r>
+    </w:p>
+    <w:tbl>
+      <w:tblPr>
+        <w:tblStyle w:val="TableGrid"/>
+        <w:tblW w:w="8640" w:type="dxa"/>
+        <w:tblLook w:firstColumn="1" w:firstRow="1" w:lastColumn="0" w:lastRow="0" w:noHBand="0" w:noVBand="1" w:val="04A0"/>
+        <w:tblLayout w:type="fixed"/>
+      </w:tblPr>
+      <w:tblGrid>
+        <w:gridCol w:w="1650"/>
+        <w:gridCol w:w="3490"/>
+        <w:gridCol w:w="3500"/>
+      </w:tblGrid>
+      <w:tr>
+        <w:trPr>
+          <w:cantSplit/>
+          <w:tblHeader/>
+        </w:trPr>
+        <w:tc>
+          <w:tcPr>
+            <w:tcW w:w="1650" w:type="dxa"/>
+            <w:vAlign w:val="center"/>
+            <w:tcMar>
+              <w:top w:w="65" w:type="dxa"/>
+              <w:bottom w:w="65" w:type="dxa"/>
+              <w:left w:w="80" w:type="dxa"/>
+              <w:right w:w="80" w:type="dxa"/>
+            </w:tcMar>
+          </w:tcPr>
+          <w:p>
+            <w:pPr>
+              <w:keepLines/>
+              <w:spacing w:after="0" w:line="250" w:lineRule="auto"/>
+              <w:jc w:val="center"/>
+            </w:pPr>
+            <w:r>
+              <w:rPr>
+                <w:rFonts w:ascii="Times New Roman" w:hAnsi="Times New Roman" w:eastAsia="宋体"/>
+                <w:b/>
+                <w:color w:val="000000"/>
+                <w:sz w:val="20"/>
+              </w:rPr>
+              <w:t xml:space="preserve">输出位置</w:t>
+            </w:r>
+          </w:p>
+        </w:tc>
+        <w:tc>
+          <w:tcPr>
+            <w:tcW w:w="3490" w:type="dxa"/>
+            <w:vAlign w:val="center"/>
+            <w:tcMar>
+              <w:top w:w="65" w:type="dxa"/>
+              <w:bottom w:w="65" w:type="dxa"/>
+              <w:left w:w="80" w:type="dxa"/>
+              <w:right w:w="80" w:type="dxa"/>
+            </w:tcMar>
+          </w:tcPr>
+          <w:p>
+            <w:pPr>
+              <w:keepLines/>
+              <w:spacing w:after="0" w:line="250" w:lineRule="auto"/>
+              <w:jc w:val="center"/>
+            </w:pPr>
+            <w:r>
+              <w:rPr>
+                <w:rFonts w:ascii="Times New Roman" w:hAnsi="Times New Roman" w:eastAsia="宋体"/>
+                <w:b/>
+                <w:color w:val="000000"/>
+                <w:sz w:val="20"/>
+              </w:rPr>
+              <w:t xml:space="preserve">实际观察</w:t>
+            </w:r>
+          </w:p>
+        </w:tc>
+        <w:tc>
+          <w:tcPr>
+            <w:tcW w:w="3500" w:type="dxa"/>
+            <w:vAlign w:val="center"/>
+            <w:tcMar>
+              <w:top w:w="65" w:type="dxa"/>
+              <w:bottom w:w="65" w:type="dxa"/>
+              <w:left w:w="80" w:type="dxa"/>
+              <w:right w:w="80" w:type="dxa"/>
+            </w:tcMar>
+          </w:tcPr>
+          <w:p>
+            <w:pPr>
+              <w:keepLines/>
+              <w:spacing w:after="0" w:line="250" w:lineRule="auto"/>
+              <w:jc w:val="center"/>
+            </w:pPr>
+            <w:r>
+              <w:rPr>
+                <w:rFonts w:ascii="Times New Roman" w:hAnsi="Times New Roman" w:eastAsia="宋体"/>
+                <w:b/>
+                <w:color w:val="000000"/>
+                <w:sz w:val="20"/>
+              </w:rPr>
+              <w:t xml:space="preserve">判断及影响</w:t>
+            </w:r>
+          </w:p>
+        </w:tc>
+      </w:tr>
+      <w:tr>
+        <w:trPr>
+          <w:cantSplit/>
+        </w:trPr>
+        <w:tc>
+          <w:tcPr>
+            <w:tcW w:w="1650" w:type="dxa"/>
+            <w:vAlign w:val="center"/>
+            <w:tcMar>
+              <w:top w:w="65" w:type="dxa"/>
+              <w:bottom w:w="65" w:type="dxa"/>
+              <w:left w:w="80" w:type="dxa"/>
+              <w:right w:w="80" w:type="dxa"/>
+            </w:tcMar>
+          </w:tcPr>
+          <w:p>
+            <w:pPr>
+              <w:keepLines/>
+              <w:spacing w:after="0" w:line="250" w:lineRule="auto"/>
+              <w:jc w:val="left"/>
+            </w:pPr>
+            <w:r>
+              <w:rPr>
+                <w:rFonts w:ascii="Times New Roman" w:hAnsi="Times New Roman" w:eastAsia="宋体"/>
+                <w:color w:val="000000"/>
+                <w:sz w:val="20"/>
+              </w:rPr>
+              <w:t xml:space="preserve">doc04 v1→v2</w:t>
+            </w:r>
+          </w:p>
+        </w:tc>
+        <w:tc>
+          <w:tcPr>
+            <w:tcW w:w="3490" w:type="dxa"/>
+            <w:vAlign w:val="center"/>
+            <w:tcMar>
+              <w:top w:w="65" w:type="dxa"/>
+              <w:bottom w:w="65" w:type="dxa"/>
+              <w:left w:w="80" w:type="dxa"/>
+              <w:right w:w="80" w:type="dxa"/>
+            </w:tcMar>
+          </w:tcPr>
+          <w:p>
+            <w:pPr>
+              <w:keepLines/>
+              <w:spacing w:after="0" w:line="250" w:lineRule="auto"/>
+              <w:jc w:val="left"/>
+            </w:pPr>
+            <w:r>
+              <w:rPr>
+                <w:rFonts w:ascii="Times New Roman" w:hAnsi="Times New Roman" w:eastAsia="宋体"/>
+                <w:color w:val="000000"/>
+                <w:sz w:val="20"/>
+              </w:rPr>
+              <w:t xml:space="preserve">v1含9条；v2含5条，增加三位教师任职学院，漏掉研究方向、职称及2019年</w:t>
+            </w:r>
+          </w:p>
+        </w:tc>
+        <w:tc>
+          <w:tcPr>
+            <w:tcW w:w="3500" w:type="dxa"/>
+            <w:vAlign w:val="center"/>
+            <w:tcMar>
+              <w:top w:w="65" w:type="dxa"/>
+              <w:bottom w:w="65" w:type="dxa"/>
+              <w:left w:w="80" w:type="dxa"/>
+              <w:right w:w="80" w:type="dxa"/>
+            </w:tcMar>
+          </w:tcPr>
+          <w:p>
+            <w:pPr>
+              <w:keepLines/>
+              <w:spacing w:after="0" w:line="250" w:lineRule="auto"/>
+              <w:jc w:val="left"/>
+            </w:pPr>
+            <w:r>
+              <w:rPr>
+                <w:rFonts w:ascii="Times New Roman" w:hAnsi="Times New Roman" w:eastAsia="宋体"/>
+                <w:color w:val="000000"/>
+                <w:sz w:val="20"/>
+              </w:rPr>
+              <w:t xml:space="preserve">补入多跳任职边但损失其他事实；v2并非全面优于v1</w:t>
+            </w:r>
+          </w:p>
+        </w:tc>
+      </w:tr>
+      <w:tr>
+        <w:trPr>
+          <w:cantSplit/>
+        </w:trPr>
+        <w:tc>
+          <w:tcPr>
+            <w:tcW w:w="1650" w:type="dxa"/>
+            <w:vAlign w:val="center"/>
+            <w:tcMar>
+              <w:top w:w="65" w:type="dxa"/>
+              <w:bottom w:w="65" w:type="dxa"/>
+              <w:left w:w="80" w:type="dxa"/>
+              <w:right w:w="80" w:type="dxa"/>
+            </w:tcMar>
+          </w:tcPr>
+          <w:p>
+            <w:pPr>
+              <w:keepLines/>
+              <w:spacing w:after="0" w:line="250" w:lineRule="auto"/>
+              <w:jc w:val="left"/>
+            </w:pPr>
+            <w:r>
+              <w:rPr>
+                <w:rFonts w:ascii="Times New Roman" w:hAnsi="Times New Roman" w:eastAsia="宋体"/>
+                <w:color w:val="000000"/>
+                <w:sz w:val="20"/>
+              </w:rPr>
+              <w:t xml:space="preserve">doc03 v2</w:t>
+            </w:r>
+          </w:p>
+        </w:tc>
+        <w:tc>
+          <w:tcPr>
+            <w:tcW w:w="3490" w:type="dxa"/>
+            <w:vAlign w:val="center"/>
+            <w:tcMar>
+              <w:top w:w="65" w:type="dxa"/>
+              <w:bottom w:w="65" w:type="dxa"/>
+              <w:left w:w="80" w:type="dxa"/>
+              <w:right w:w="80" w:type="dxa"/>
+            </w:tcMar>
+          </w:tcPr>
+          <w:p>
+            <w:pPr>
+              <w:keepLines/>
+              <w:spacing w:after="0" w:line="250" w:lineRule="auto"/>
+              <w:jc w:val="left"/>
+            </w:pPr>
+            <w:r>
+              <w:rPr>
+                <w:rFonts w:ascii="Times New Roman" w:hAnsi="Times New Roman" w:eastAsia="宋体"/>
+                <w:color w:val="000000"/>
+                <w:sz w:val="20"/>
+              </w:rPr>
+              <w:t xml:space="preserve">计算机学院—设计→计算机科学与技术 / 软件工程</w:t>
+            </w:r>
+          </w:p>
+        </w:tc>
+        <w:tc>
+          <w:tcPr>
+            <w:tcW w:w="3500" w:type="dxa"/>
+            <w:vAlign w:val="center"/>
+            <w:tcMar>
+              <w:top w:w="65" w:type="dxa"/>
+              <w:bottom w:w="65" w:type="dxa"/>
+              <w:left w:w="80" w:type="dxa"/>
+              <w:right w:w="80" w:type="dxa"/>
+            </w:tcMar>
+          </w:tcPr>
+          <w:p>
+            <w:pPr>
+              <w:keepLines/>
+              <w:spacing w:after="0" w:line="250" w:lineRule="auto"/>
+              <w:jc w:val="left"/>
+            </w:pPr>
+            <w:r>
+              <w:rPr>
+                <w:rFonts w:ascii="Times New Roman" w:hAnsi="Times New Roman" w:eastAsia="宋体"/>
+                <w:color w:val="000000"/>
+                <w:sz w:val="20"/>
+              </w:rPr>
+              <w:t xml:space="preserve">原文“设”专业，关系词误写；JSON格式合格仍有语义错误</w:t>
+            </w:r>
+          </w:p>
+        </w:tc>
+      </w:tr>
+      <w:tr>
+        <w:trPr>
+          <w:cantSplit/>
+        </w:trPr>
+        <w:tc>
+          <w:tcPr>
+            <w:tcW w:w="1650" w:type="dxa"/>
+            <w:vAlign w:val="center"/>
+            <w:tcMar>
+              <w:top w:w="65" w:type="dxa"/>
+              <w:bottom w:w="65" w:type="dxa"/>
+              <w:left w:w="80" w:type="dxa"/>
+              <w:right w:w="80" w:type="dxa"/>
+            </w:tcMar>
+          </w:tcPr>
+          <w:p>
+            <w:pPr>
+              <w:keepLines/>
+              <w:spacing w:after="0" w:line="250" w:lineRule="auto"/>
+              <w:jc w:val="left"/>
+            </w:pPr>
+            <w:r>
+              <w:rPr>
+                <w:rFonts w:ascii="Times New Roman" w:hAnsi="Times New Roman" w:eastAsia="宋体"/>
+                <w:color w:val="000000"/>
+                <w:sz w:val="20"/>
+              </w:rPr>
+              <w:t xml:space="preserve">doc13 v2</w:t>
+            </w:r>
+          </w:p>
+        </w:tc>
+        <w:tc>
+          <w:tcPr>
+            <w:tcW w:w="3490" w:type="dxa"/>
+            <w:vAlign w:val="center"/>
+            <w:tcMar>
+              <w:top w:w="65" w:type="dxa"/>
+              <w:bottom w:w="65" w:type="dxa"/>
+              <w:left w:w="80" w:type="dxa"/>
+              <w:right w:w="80" w:type="dxa"/>
+            </w:tcMar>
+          </w:tcPr>
+          <w:p>
+            <w:pPr>
+              <w:keepLines/>
+              <w:spacing w:after="0" w:line="250" w:lineRule="auto"/>
+              <w:jc w:val="left"/>
+            </w:pPr>
+            <w:r>
+              <w:rPr>
+                <w:rFonts w:ascii="Times New Roman" w:hAnsi="Times New Roman" w:eastAsia="宋体"/>
+                <w:color w:val="000000"/>
+                <w:sz w:val="20"/>
+              </w:rPr>
+              <w:t xml:space="preserve">只抽分馆位置与收藏，遗漏藏书380万、7:00—22:00开放</w:t>
+            </w:r>
+          </w:p>
+        </w:tc>
+        <w:tc>
+          <w:tcPr>
+            <w:tcW w:w="3500" w:type="dxa"/>
+            <w:vAlign w:val="center"/>
+            <w:tcMar>
+              <w:top w:w="65" w:type="dxa"/>
+              <w:bottom w:w="65" w:type="dxa"/>
+              <w:left w:w="80" w:type="dxa"/>
+              <w:right w:w="80" w:type="dxa"/>
+            </w:tcMar>
+          </w:tcPr>
+          <w:p>
+            <w:pPr>
+              <w:keepLines/>
+              <w:spacing w:after="0" w:line="250" w:lineRule="auto"/>
+              <w:jc w:val="left"/>
+            </w:pPr>
+            <w:r>
+              <w:rPr>
+                <w:rFonts w:ascii="Times New Roman" w:hAnsi="Times New Roman" w:eastAsia="宋体"/>
+                <w:color w:val="000000"/>
+                <w:sz w:val="20"/>
+              </w:rPr>
+              <w:t xml:space="preserve">图谱事实覆盖不完整，原文级检索命中可能掩盖该遗漏</w:t>
+            </w:r>
+          </w:p>
+        </w:tc>
+      </w:tr>
+      <w:tr>
+        <w:trPr>
+          <w:cantSplit/>
+        </w:trPr>
+        <w:tc>
+          <w:tcPr>
+            <w:tcW w:w="1650" w:type="dxa"/>
+            <w:vAlign w:val="center"/>
+            <w:tcMar>
+              <w:top w:w="65" w:type="dxa"/>
+              <w:bottom w:w="65" w:type="dxa"/>
+              <w:left w:w="80" w:type="dxa"/>
+              <w:right w:w="80" w:type="dxa"/>
+            </w:tcMar>
+          </w:tcPr>
+          <w:p>
+            <w:pPr>
+              <w:keepLines/>
+              <w:spacing w:after="0" w:line="250" w:lineRule="auto"/>
+              <w:jc w:val="left"/>
+            </w:pPr>
+            <w:r>
+              <w:rPr>
+                <w:rFonts w:ascii="Times New Roman" w:hAnsi="Times New Roman" w:eastAsia="宋体"/>
+                <w:color w:val="000000"/>
+                <w:sz w:val="20"/>
+              </w:rPr>
+              <w:t xml:space="preserve">社区9摘要</w:t>
+            </w:r>
+          </w:p>
+        </w:tc>
+        <w:tc>
+          <w:tcPr>
+            <w:tcW w:w="3490" w:type="dxa"/>
+            <w:vAlign w:val="center"/>
+            <w:tcMar>
+              <w:top w:w="65" w:type="dxa"/>
+              <w:bottom w:w="65" w:type="dxa"/>
+              <w:left w:w="80" w:type="dxa"/>
+              <w:right w:w="80" w:type="dxa"/>
+            </w:tcMar>
+          </w:tcPr>
+          <w:p>
+            <w:pPr>
+              <w:keepLines/>
+              <w:spacing w:after="0" w:line="250" w:lineRule="auto"/>
+              <w:jc w:val="left"/>
+            </w:pPr>
+            <w:r>
+              <w:rPr>
+                <w:rFonts w:ascii="Times New Roman" w:hAnsi="Times New Roman" w:eastAsia="宋体"/>
+                <w:color w:val="000000"/>
+                <w:sz w:val="20"/>
+              </w:rPr>
+              <w:t xml:space="preserve">增写“馆藏与空间由图书馆统一建设”等管理安排</w:t>
+            </w:r>
+          </w:p>
+        </w:tc>
+        <w:tc>
+          <w:tcPr>
+            <w:tcW w:w="3500" w:type="dxa"/>
+            <w:vAlign w:val="center"/>
+            <w:tcMar>
+              <w:top w:w="65" w:type="dxa"/>
+              <w:bottom w:w="65" w:type="dxa"/>
+              <w:left w:w="80" w:type="dxa"/>
+              <w:right w:w="80" w:type="dxa"/>
+            </w:tcMar>
+          </w:tcPr>
+          <w:p>
+            <w:pPr>
+              <w:keepLines/>
+              <w:spacing w:after="0" w:line="250" w:lineRule="auto"/>
+              <w:jc w:val="left"/>
+            </w:pPr>
+            <w:r>
+              <w:rPr>
+                <w:rFonts w:ascii="Times New Roman" w:hAnsi="Times New Roman" w:eastAsia="宋体"/>
+                <w:color w:val="000000"/>
+                <w:sz w:val="20"/>
+              </w:rPr>
+              <w:t xml:space="preserve">doc13无依据；提示要求并未消除幻觉</w:t>
+            </w:r>
+          </w:p>
+        </w:tc>
+      </w:tr>
+      <w:tr>
+        <w:trPr>
+          <w:cantSplit/>
+        </w:trPr>
+        <w:tc>
+          <w:tcPr>
+            <w:tcW w:w="1650" w:type="dxa"/>
+            <w:vAlign w:val="center"/>
+            <w:tcMar>
+              <w:top w:w="65" w:type="dxa"/>
+              <w:bottom w:w="65" w:type="dxa"/>
+              <w:left w:w="80" w:type="dxa"/>
+              <w:right w:w="80" w:type="dxa"/>
+            </w:tcMar>
+          </w:tcPr>
+          <w:p>
+            <w:pPr>
+              <w:keepLines/>
+              <w:spacing w:after="0" w:line="250" w:lineRule="auto"/>
+              <w:jc w:val="left"/>
+            </w:pPr>
+            <w:r>
+              <w:rPr>
+                <w:rFonts w:ascii="Times New Roman" w:hAnsi="Times New Roman" w:eastAsia="宋体"/>
+                <w:color w:val="000000"/>
+                <w:sz w:val="20"/>
+              </w:rPr>
+              <w:t xml:space="preserve">社区12 / 14摘要</w:t>
+            </w:r>
+          </w:p>
+        </w:tc>
+        <w:tc>
+          <w:tcPr>
+            <w:tcW w:w="3490" w:type="dxa"/>
+            <w:vAlign w:val="center"/>
+            <w:tcMar>
+              <w:top w:w="65" w:type="dxa"/>
+              <w:bottom w:w="65" w:type="dxa"/>
+              <w:left w:w="80" w:type="dxa"/>
+              <w:right w:w="80" w:type="dxa"/>
+            </w:tcMar>
+          </w:tcPr>
+          <w:p>
+            <w:pPr>
+              <w:keepLines/>
+              <w:spacing w:after="0" w:line="250" w:lineRule="auto"/>
+              <w:jc w:val="left"/>
+            </w:pPr>
+            <w:r>
+              <w:rPr>
+                <w:rFonts w:ascii="Times New Roman" w:hAnsi="Times New Roman" w:eastAsia="宋体"/>
+                <w:color w:val="000000"/>
+                <w:sz w:val="20"/>
+              </w:rPr>
+              <w:t xml:space="preserve">新增“课程共建与运行管理”“共建类合作”等分类</w:t>
+            </w:r>
+          </w:p>
+        </w:tc>
+        <w:tc>
+          <w:tcPr>
+            <w:tcW w:w="3500" w:type="dxa"/>
+            <w:vAlign w:val="center"/>
+            <w:tcMar>
+              <w:top w:w="65" w:type="dxa"/>
+              <w:bottom w:w="65" w:type="dxa"/>
+              <w:left w:w="80" w:type="dxa"/>
+              <w:right w:w="80" w:type="dxa"/>
+            </w:tcMar>
+          </w:tcPr>
+          <w:p>
+            <w:pPr>
+              <w:keepLines/>
+              <w:spacing w:after="0" w:line="250" w:lineRule="auto"/>
+              <w:jc w:val="left"/>
+            </w:pPr>
+            <w:r>
+              <w:rPr>
+                <w:rFonts w:ascii="Times New Roman" w:hAnsi="Times New Roman" w:eastAsia="宋体"/>
+                <w:color w:val="000000"/>
+                <w:sz w:val="20"/>
+              </w:rPr>
+              <w:t xml:space="preserve">来源分别为doc08课程规则、doc15国际交流；分类受提示词牵引，无直接依据</w:t>
+            </w:r>
+          </w:p>
+        </w:tc>
+      </w:tr>
+      <w:tr>
+        <w:trPr>
+          <w:cantSplit/>
+        </w:trPr>
+        <w:tc>
+          <w:tcPr>
+            <w:tcW w:w="1650" w:type="dxa"/>
+            <w:vAlign w:val="center"/>
+            <w:tcMar>
+              <w:top w:w="65" w:type="dxa"/>
+              <w:bottom w:w="65" w:type="dxa"/>
+              <w:left w:w="80" w:type="dxa"/>
+              <w:right w:w="80" w:type="dxa"/>
+            </w:tcMar>
+          </w:tcPr>
+          <w:p>
+            <w:pPr>
+              <w:keepLines/>
+              <w:spacing w:after="0" w:line="250" w:lineRule="auto"/>
+              <w:jc w:val="left"/>
+            </w:pPr>
+            <w:r>
+              <w:rPr>
+                <w:rFonts w:ascii="Times New Roman" w:hAnsi="Times New Roman" w:eastAsia="宋体"/>
+                <w:color w:val="000000"/>
+                <w:sz w:val="20"/>
+              </w:rPr>
+              <w:t xml:space="preserve">doc10两版 / doc15两版</w:t>
+            </w:r>
+          </w:p>
+        </w:tc>
+        <w:tc>
+          <w:tcPr>
+            <w:tcW w:w="3490" w:type="dxa"/>
+            <w:vAlign w:val="center"/>
+            <w:tcMar>
+              <w:top w:w="65" w:type="dxa"/>
+              <w:bottom w:w="65" w:type="dxa"/>
+              <w:left w:w="80" w:type="dxa"/>
+              <w:right w:w="80" w:type="dxa"/>
+            </w:tcMar>
+          </w:tcPr>
+          <w:p>
+            <w:pPr>
+              <w:keepLines/>
+              <w:spacing w:after="0" w:line="250" w:lineRule="auto"/>
+              <w:jc w:val="left"/>
+            </w:pPr>
+            <w:r>
+              <w:rPr>
+                <w:rFonts w:ascii="Times New Roman" w:hAnsi="Times New Roman" w:eastAsia="宋体"/>
+                <w:color w:val="000000"/>
+                <w:sz w:val="20"/>
+              </w:rPr>
+              <w:t xml:space="preserve">doc10均区分大学共建与学院管理；doc15均使用“学校”实体</w:t>
+            </w:r>
+          </w:p>
+        </w:tc>
+        <w:tc>
+          <w:tcPr>
+            <w:tcW w:w="3500" w:type="dxa"/>
+            <w:vAlign w:val="center"/>
+            <w:tcMar>
+              <w:top w:w="65" w:type="dxa"/>
+              <w:bottom w:w="65" w:type="dxa"/>
+              <w:left w:w="80" w:type="dxa"/>
+              <w:right w:w="80" w:type="dxa"/>
+            </w:tcMar>
+          </w:tcPr>
+          <w:p>
+            <w:pPr>
+              <w:keepLines/>
+              <w:spacing w:after="0" w:line="250" w:lineRule="auto"/>
+              <w:jc w:val="left"/>
+            </w:pPr>
+            <w:r>
+              <w:rPr>
+                <w:rFonts w:ascii="Times New Roman" w:hAnsi="Times New Roman" w:eastAsia="宋体"/>
+                <w:color w:val="000000"/>
+                <w:sz w:val="20"/>
+              </w:rPr>
+              <w:t xml:space="preserve">不能宣称v2修复v1的管理错误；泛指实体仍未与大学自动连通</w:t>
+            </w:r>
+          </w:p>
+        </w:tc>
+      </w:tr>
+    </w:tbl>
+    <w:p>
+      <w:pPr>
+        <w:keepLines/>
+        <w:spacing w:after="50" w:line="40" w:lineRule="auto"/>
+        <w:jc w:val="left"/>
+      </w:pPr>
+      <w:r>
+        <w:rPr>
+          <w:rFonts w:ascii="Times New Roman" w:hAnsi="Times New Roman" w:eastAsia="宋体"/>
+          <w:color w:val="000000"/>
+          <w:sz w:val="2"/>
+        </w:rPr>
+        <w:t xml:space="preserve"/>
+      </w:r>
+    </w:p>
+    <w:p>
+      <w:pPr>
+        <w:keepLines/>
+        <w:spacing w:after="90" w:line="280" w:lineRule="auto"/>
+        <w:jc w:val="left"/>
+      </w:pPr>
+      <w:r>
+        <w:rPr>
+          <w:rFonts w:ascii="Times New Roman" w:hAnsi="Times New Roman" w:eastAsia="宋体"/>
+          <w:color w:val="000000"/>
+          <w:sz w:val="22"/>
+        </w:rPr>
+        <w:t xml:space="preserve">上述原始错误保留在extractions_v*.json与community_summaries.json。未经修正的现场索引仍用于表7a，避免事后择优。来源审计见live_knowledge_audit.json；抽取约束应按文档任务定制，泛用“共建/管理”措辞可能把无关事实引向错误分类。今后可分开验收结构、覆盖和语义，逐条回溯来源后再用于正式答案。</w:t>
+      </w:r>
+    </w:p>
+    <w:p>
+      <w:pPr>
+        <w:keepNext/>
+        <w:keepLines/>
+        <w:pageBreakBefore/>
+        <w:spacing w:before="160" w:after="80" w:line="276" w:lineRule="auto"/>
+      </w:pPr>
+      <w:r>
+        <w:rPr>
+          <w:rFonts w:ascii="Arial" w:hAnsi="Arial" w:eastAsia="黑体"/>
+          <w:b/>
+          <w:color w:val="000000"/>
+          <w:sz w:val="24"/>
+        </w:rPr>
         <w:t>5.2  失败案例分析（每范式至少 2 例）</w:t>
       </w:r>
     </w:p>
@@ -11775,7 +13243,7 @@
                 <w:color w:val="000000"/>
                 <w:sz w:val="20"/>
               </w:rPr>
-              <w:t xml:space="preserve">按指南与样板分析实验范围；延续前次目录结构</w:t>
+              <w:t xml:space="preserve">Codex按指南与样板分析范围，沿用前次目录结构</w:t>
             </w:r>
           </w:p>
         </w:tc>
@@ -11888,7 +13356,7 @@
                 <w:color w:val="000000"/>
                 <w:sz w:val="20"/>
               </w:rPr>
-              <w:t xml:space="preserve">采用指南允许的本地BGE与预置知识库，检索不需生成API</w:t>
+              <w:t xml:space="preserve">先完成本地BGE参考检索；保留原始基线便于比较</w:t>
             </w:r>
           </w:p>
         </w:tc>
@@ -11947,7 +13415,7 @@
                 <w:color w:val="000000"/>
                 <w:sz w:val="20"/>
               </w:rPr>
-              <w:t xml:space="preserve">代码实现与复核</w:t>
+              <w:t xml:space="preserve">提供生成接口</w:t>
             </w:r>
           </w:p>
         </w:tc>
@@ -11974,7 +13442,7 @@
                 <w:color w:val="000000"/>
                 <w:sz w:val="20"/>
               </w:rPr>
-              <w:t xml:space="preserve">Codex实现、7项测试、独立代码审查与结果回放</w:t>
+              <w:t xml:space="preserve">本人提供DeepSeek API，授权追加调用</w:t>
             </w:r>
           </w:p>
         </w:tc>
@@ -12001,7 +13469,7 @@
                 <w:color w:val="000000"/>
                 <w:sz w:val="20"/>
               </w:rPr>
-              <w:t xml:space="preserve">检查scope、文档去重、JSON形状、实体名称及3跳/6前沿边界；接受通过核验的实现</w:t>
+              <w:t xml:space="preserve">密钥不记录；61次真实调用完成答案、抽取、社区摘要和Wiki构建</w:t>
             </w:r>
           </w:p>
         </w:tc>
@@ -12060,7 +13528,7 @@
                 <w:color w:val="000000"/>
                 <w:sz w:val="20"/>
               </w:rPr>
-              <w:t xml:space="preserve">本地运行与分析</w:t>
+              <w:t xml:space="preserve">代码与结果核验</w:t>
             </w:r>
           </w:p>
         </w:tc>
@@ -12087,7 +13555,7 @@
                 <w:color w:val="000000"/>
                 <w:sz w:val="20"/>
               </w:rPr>
-              <w:t xml:space="preserve">CPU正式20题、内置15题K扫描、Local/Global与RRF对照</w:t>
+              <w:t xml:space="preserve">Codex实现、13项测试、独立审查与结果回放</w:t>
             </w:r>
           </w:p>
         </w:tc>
@@ -12114,7 +13582,7 @@
                 <w:color w:val="000000"/>
                 <w:sz w:val="20"/>
               </w:rPr>
-              <w:t xml:space="preserve">保留Vector更强与RRF无提升的实际结果，不以预期替代数据</w:t>
+              <w:t xml:space="preserve">检查scope、去重、来源、实体、路径边界和API缓存/错误处理</w:t>
             </w:r>
           </w:p>
         </w:tc>
@@ -12173,7 +13641,7 @@
                 <w:color w:val="000000"/>
                 <w:sz w:val="20"/>
               </w:rPr>
-              <w:t xml:space="preserve">报告与评分</w:t>
+              <w:t xml:space="preserve">分析与报告</w:t>
             </w:r>
           </w:p>
         </w:tc>
@@ -12200,7 +13668,7 @@
                 <w:color w:val="000000"/>
                 <w:sz w:val="20"/>
               </w:rPr>
-              <w:t xml:space="preserve">按更新样板填报，保存上下文、答案及AI初评分</w:t>
+              <w:t xml:space="preserve">Codex复核参考与现场指标、逐条审计原文</w:t>
             </w:r>
           </w:p>
         </w:tc>
@@ -12227,7 +13695,7 @@
                 <w:color w:val="000000"/>
                 <w:sz w:val="20"/>
               </w:rPr>
-              <w:t xml:space="preserve">人工评分未确认；不记录尚未发生的亲手操作或人工评阅</w:t>
+              <w:t xml:space="preserve">保留未提升及生成错误；同模型评分仍待本人确认</w:t>
             </w:r>
           </w:p>
         </w:tc>
@@ -12260,7 +13728,7 @@
           <w:color w:val="000000"/>
           <w:sz w:val="22"/>
         </w:rPr>
-        <w:t xml:space="preserve">本次由我指定实验资料并委托Codex实现、检查和整理。表9的引号内容是实际用户消息，其余为系统操作摘要；没有把生成的提示词草案写成我已经执行的原文，也不把此前实验二的个人操作声明移用到实验四。下一步需要我对九个答案与来源进行人工评分确认。</w:t>
+        <w:t xml:space="preserve">本次由我指定实验资料、委托实现并提供DeepSeek接口；Codex完成代码、运行、审查和报告整理。引号内容是实际用户消息，其他是操作摘要。密钥未写入报告或Git；不把此前实验二的个人操作声明移用到实验四。下一步需要我逐例确认或调整人工评分。</w:t>
       </w:r>
     </w:p>
     <w:p>
@@ -12494,7 +13962,7 @@
           <w:color w:val="000000"/>
           <w:sz w:val="22"/>
         </w:rPr>
-        <w:t xml:space="preserve">人工评分可用统一量表、隐藏范式名称、先拆原子事实、逐条标注来源，再由两人独立评分并讨论分歧。必须同时记录答案完整性，防止拒答总获高忠实度却没有解决问题。对于没有事实声明的输出，支持比例分母为0，应另行处理。</w:t>
+        <w:t xml:space="preserve">人工评分可用统一量表、隐藏范式名称、先拆原子事实并逐条标注来源，再由两人独立评分讨论分歧。还需记录完整性：拒答可能忠实却未解决问题；没有事实声明时支持比例不定义，但不能把含事实的拒答错误地算成零声明。</w:t>
       </w:r>
     </w:p>
     <w:p>
@@ -12509,7 +13977,7 @@
           <w:color w:val="000000"/>
           <w:sz w:val="22"/>
         </w:rPr>
-        <w:t xml:space="preserve">按教材式8-8，自动评忠实度先把答案拆成事实声明，再检查每条是否能由检索上下文推出，以支持声明数÷总声明数得到比例。RAGAS采用此类LLM辅助检查思路。[4] 评分模型也可能误拆声明、漏查否定、受表达风格影响或偏好自己的答案。固定评审模型和提示、抽样人工复核及报告分歧能减轻偏差；本次没有运行RAGAS，表5只是Codex初评。</w:t>
+        <w:t xml:space="preserve">按教材式8-8，自动评审先拆事实，再核对能否由检索上下文推出，支持声明数÷总声明数为忠实度比例；RAGAS采用此类LLM辅助检查思路。[4] 本次实际使用DeepSeek同模型初评九例，均给5分，审计发现Wiki Q01漏拆学院声明，说明同模型初评仍会出现拆分错误，自评偏差风险需人工复核。固定提示、核查引用和人工复评可减轻偏差；本次未运行RAGAS，不把同模型初评视为人工确认。</w:t>
       </w:r>
     </w:p>
     <w:p>
@@ -12540,7 +14008,7 @@
           <w:color w:val="000000"/>
           <w:sz w:val="22"/>
         </w:rPr>
-        <w:t xml:space="preserve">本次保留两版抽取提示词草案，但没有进行现场LLM抽取或多轮API试验。第一版仅要求头实体、关系、尾实体和JSON；第二版补充“只抽取原文支持、保留全称、不把运行管理写成共建、不补人数年份教材”。这一约束来自对预置来源错误的核查；不能据草案数量声称成功迭代了两轮抽取。</w:t>
+        <w:t xml:space="preserve">本次有两版实际抽取提示词：v1只要求三元组与JSON；v2要求原文支持、完整机构名称、明确方向，禁止补人数年份教材、混淆管理与共建。两版预先定义，doc04/doc10/doc15有同文对照；没有依据本次输出继续修改提示词。doc04的v2补回任职关系但漏掉研究方向，doc10两版均正确区分管理；因此不能声称加强约束就必然提高全部事实覆盖。</w:t>
       </w:r>
     </w:p>
     <w:p>
@@ -12555,7 +14023,7 @@
           <w:color w:val="000000"/>
           <w:sz w:val="22"/>
         </w:rPr>
-        <w:t xml:space="preserve">代码需检查：JSON只用json.loads，禁止eval，数组必须由三个非空字符串组成；来源号存在并可追溯。实体归一需保留原名、处理空格和别名，避免把不同人物合并。多跳展开需要限制深度及前沿，去重节点与边并记录回退；global参数必须实际传入检索函数。格式合格也不代表三元组语义正确，最终仍要对照原文。</w:t>
+        <w:t xml:space="preserve">代码审查分三层：JSON用json.loads不用eval，字段为三个非空字符串；来源存在且可追溯；每条关系语义与方向对照原文。doc03“设”变“设计”就是第三层失败。归一还需处理泛指“学校”和同名歧义，简单去空格不足以实体消歧。检索须限制深度/前沿、去重节点与边、记录回退并实传global；API需区分失败/截断、隔离密钥、保留请求和响应，评审不得越出返回上下文。</w:t>
       </w:r>
     </w:p>
     <w:p>
@@ -15011,7 +16479,7 @@
           <w:color w:val="000000"/>
           <w:sz w:val="22"/>
         </w:rPr>
-        <w:t xml:space="preserve">独立复核：7项逻辑测试通过；19组实验共730条逐题结果、180条汇总指标与完整检索对象离线回放一致；4条实体归一诊断与3组MRR核对一致。指定BGE本地权重重新编码92个文本，最大差约1.45×10⁻⁷，确认正式结果来自真实模型。</w:t>
+        <w:t xml:space="preserve">独立复核：原7项逻辑测试与新增6项API离线边界测试均通过；19组实验共730条逐题结果、180条汇总指标与完整检索对象离线回放一致；4条实体归一诊断与3组MRR核对一致。指定BGE本地权重重新编码92个文本，最大差约1.45×10⁻⁷，确认正式结果来自真实模型。</w:t>
       </w:r>
     </w:p>
     <w:p>
@@ -15041,7 +16509,7 @@
           <w:color w:val="000000"/>
           <w:sz w:val="22"/>
         </w:rPr>
-        <w:t xml:space="preserve">本地依照实验一至三的文件结构：提交材料保存正式报告，lab04_rag保存代码、原始结果与报告副本，tools保存构建与排版核验。Git规范目录为labs_repo/lab04。实验四未连接HPC、未启动远程作业。待完成项为9例人工忠实度评分；当前明确保留AI初评状态。</w:t>
+        <w:t xml:space="preserve">本地依照实验一至三的文件结构：提交材料保存正式报告，lab04_rag保存代码、原始结果与报告副本，tools保存构建与排版核验。Git规范目录为labs_repo/lab04。实验四未连接HPC、未启动远程作业。现场DeepSeek补充的61份调用、输入/输出、使用量和知识构建结果另存results/live_api；现场指标、缓存向量回放及来源审计独立核验。复现：python deepseek_live.py experiment；密钥从DEEPSEEK_API_KEY进程环境读取，勿写入命令或提交文件。待完成项为9例人工忠实度评分；当前明确保留AI初评状态。</w:t>
       </w:r>
     </w:p>
     <w:p>
@@ -15057,6 +16525,21 @@
           <w:sz w:val="20"/>
         </w:rPr>
         <w:t xml:space="preserve">仓库：https://github.com/s-max-oss/llm-course-labs/tree/main/lab04</w:t>
+      </w:r>
+    </w:p>
+    <w:p>
+      <w:pPr>
+        <w:keepLines/>
+        <w:spacing w:after="90" w:line="280" w:lineRule="auto"/>
+        <w:jc w:val="left"/>
+      </w:pPr>
+      <w:r>
+        <w:rPr>
+          <w:rFonts w:ascii="Times New Roman" w:hAnsi="Times New Roman" w:eastAsia="宋体"/>
+          <w:color w:val="000000"/>
+          <w:sz w:val="22"/>
+        </w:rPr>
+        <w:t xml:space="preserve">现场独立复核另覆盖10组实验、480条逐题记录、120个汇总及123×512维向量回放；BGE离线重新编码最大差约1.45×10⁻⁷。source_at_run.py保留实际运行源码，其哈希与run_summary一致；之后仅强化三项评审字段类型检查，未改写原始调用结果。</w:t>
       </w:r>
     </w:p>
     <w:p>
@@ -15133,6 +16616,21 @@
           <w:sz w:val="21"/>
         </w:rPr>
         <w:t xml:space="preserve">[4] Es S, et al. RAGAS Automated Evaluation of Retrieval Augmented Generation. EACL 2024 Demonstrations. https://aclanthology.org/2024.eacl-demo.16/</w:t>
+      </w:r>
+    </w:p>
+    <w:p>
+      <w:pPr>
+        <w:keepLines/>
+        <w:spacing w:after="160" w:line="280" w:lineRule="auto"/>
+        <w:jc w:val="left"/>
+      </w:pPr>
+      <w:r>
+        <w:rPr>
+          <w:rFonts w:ascii="Times New Roman" w:hAnsi="Times New Roman" w:eastAsia="宋体"/>
+          <w:color w:val="000000"/>
+          <w:sz w:val="21"/>
+        </w:rPr>
+        <w:t xml:space="preserve">[5] DeepSeek官方API与JSON Output说明。https://api-docs.deepseek.com/ ; https://api-docs.deepseek.com/guides/json_mode/ （2026年10月3日核查；模型请求及响应名以实际记录为准）</w:t>
       </w:r>
     </w:p>
     <w:sectPr>

</xml_diff>

<commit_message>
Clarify lab04 collaboration and confirm paired-example scores
</commit_message>
<xml_diff>
--- a/lab04/report/2024311281_孙驰_实验作业四.docx
+++ b/lab04/report/2024311281_孙驰_实验作业四.docx
@@ -183,7 +183,7 @@
           <w:color w:val="000000"/>
           <w:sz w:val="22"/>
         </w:rPr>
-        <w:t xml:space="preserve">使用本地真实中文嵌入模型，比较向量、图谱与条目化知识的证据覆盖；记录窗口扫描、失败例与可复核的原始结果。人工忠实度评分待确认。</w:t>
+        <w:t xml:space="preserve">使用本地真实中文嵌入模型，比较向量、图谱与条目化知识的证据覆盖；记录窗口扫描、失败例与可复核的原始结果。忠实度评分由本人参考AI理由后确认。</w:t>
       </w:r>
     </w:p>
     <w:p>
@@ -261,7 +261,7 @@
           <w:color w:val="000000"/>
           <w:sz w:val="22"/>
         </w:rPr>
-        <w:t xml:space="preserve">在参考知识库评测之后，使用本人提供的DeepSeek API追加实际答案生成、三元组抽取、社区摘要和Wiki条目构建。原基线保持不变；新知识库另行评测并审计生成错误，人工评分仍待确认。</w:t>
+        <w:t xml:space="preserve">在参考知识库评测之后，使用本人提供的DeepSeek API追加实际答案生成、三元组抽取、社区摘要和Wiki条目构建。原基线保持不变；新知识库另行评测并审计生成错误，九例评分由本人参考AI初评理由后确认。</w:t>
       </w:r>
     </w:p>
     <w:p>
@@ -823,7 +823,7 @@
                 <w:color w:val="000000"/>
                 <w:sz w:val="20"/>
               </w:rPr>
-              <w:t xml:space="preserve">61次真实调用；同模型AI初评，非人工评分</w:t>
+              <w:t xml:space="preserve">61次真实调用；本人参考同模型初评确认评分</w:t>
             </w:r>
           </w:p>
         </w:tc>
@@ -7291,7 +7291,7 @@
           <w:color w:val="4B5563"/>
           <w:sz w:val="21"/>
         </w:rPr>
-        <w:t xml:space="preserve">表 5  DeepSeek答案忠实度AI初评 待人工确认</w:t>
+        <w:t xml:space="preserve">表 5  忠实度AI初评与本人确认评分</w:t>
       </w:r>
     </w:p>
     <w:p>
@@ -7306,7 +7306,7 @@
           <w:color w:val="000000"/>
           <w:sz w:val="22"/>
         </w:rPr>
-        <w:t xml:space="preserve">预选Q01/Q06/Q11，覆盖三类题；九例都使用参考基线K=5返回的原始文档，调用DeepSeek生成，再以同模型评审。请求不含gold、参考答案或人工分数。表中为压缩要点，完整回答、声明及原文在results/live_api/answer_review.json，请求与响应在calls/；human_score均为空。</w:t>
+        <w:t xml:space="preserve">Q01（多跳）、Q06（事实）、Q11（全局）各由三范式回答，共3题×3范式=9个答案样例，符合“每范式抽3题”。跨范式同题构成配对对照，只覆盖三个独立问题。本人参考AI初评理由确认均为5分，未开展独立盲审。原答案与声明见results/live_api/answer_review.json，调用见calls/；当前确认分数见report/human_scores.json。</w:t>
       </w:r>
     </w:p>
     <w:tbl>
@@ -7408,7 +7408,7 @@
                 <w:color w:val="000000"/>
                 <w:sz w:val="20"/>
               </w:rPr>
-              <w:t xml:space="preserve">初评分</w:t>
+              <w:t xml:space="preserve">AI / 本人</w:t>
             </w:r>
           </w:p>
         </w:tc>
@@ -7550,9 +7550,7 @@
                 <w:color w:val="000000"/>
                 <w:sz w:val="20"/>
               </w:rPr>
-              <w:t xml:space="preserve">5</w:t>
-              <w:br/>
-              <w:t xml:space="preserve">待确认</w:t>
+              <w:t xml:space="preserve">5 / 5</w:t>
             </w:r>
           </w:p>
         </w:tc>
@@ -7692,9 +7690,7 @@
                 <w:color w:val="000000"/>
                 <w:sz w:val="20"/>
               </w:rPr>
-              <w:t xml:space="preserve">5</w:t>
-              <w:br/>
-              <w:t xml:space="preserve">待确认</w:t>
+              <w:t xml:space="preserve">5 / 5</w:t>
             </w:r>
           </w:p>
         </w:tc>
@@ -7834,9 +7830,7 @@
                 <w:color w:val="000000"/>
                 <w:sz w:val="20"/>
               </w:rPr>
-              <w:t xml:space="preserve">5</w:t>
-              <w:br/>
-              <w:t xml:space="preserve">待确认</w:t>
+              <w:t xml:space="preserve">5 / 5</w:t>
             </w:r>
           </w:p>
         </w:tc>
@@ -7976,9 +7970,7 @@
                 <w:color w:val="000000"/>
                 <w:sz w:val="20"/>
               </w:rPr>
-              <w:t xml:space="preserve">5</w:t>
-              <w:br/>
-              <w:t xml:space="preserve">待确认</w:t>
+              <w:t xml:space="preserve">5 / 5</w:t>
             </w:r>
           </w:p>
         </w:tc>
@@ -8118,9 +8110,7 @@
                 <w:color w:val="000000"/>
                 <w:sz w:val="20"/>
               </w:rPr>
-              <w:t xml:space="preserve">5</w:t>
-              <w:br/>
-              <w:t xml:space="preserve">待确认</w:t>
+              <w:t xml:space="preserve">5 / 5</w:t>
             </w:r>
           </w:p>
         </w:tc>
@@ -8260,9 +8250,7 @@
                 <w:color w:val="000000"/>
                 <w:sz w:val="20"/>
               </w:rPr>
-              <w:t xml:space="preserve">5</w:t>
-              <w:br/>
-              <w:t xml:space="preserve">待确认</w:t>
+              <w:t xml:space="preserve">5 / 5</w:t>
             </w:r>
           </w:p>
         </w:tc>
@@ -8402,9 +8390,7 @@
                 <w:color w:val="000000"/>
                 <w:sz w:val="20"/>
               </w:rPr>
-              <w:t xml:space="preserve">5</w:t>
-              <w:br/>
-              <w:t xml:space="preserve">待确认</w:t>
+              <w:t xml:space="preserve">5 / 5</w:t>
             </w:r>
           </w:p>
         </w:tc>
@@ -8544,9 +8530,7 @@
                 <w:color w:val="000000"/>
                 <w:sz w:val="20"/>
               </w:rPr>
-              <w:t xml:space="preserve">5</w:t>
-              <w:br/>
-              <w:t xml:space="preserve">待确认</w:t>
+              <w:t xml:space="preserve">5 / 5</w:t>
             </w:r>
           </w:p>
         </w:tc>
@@ -8686,9 +8670,7 @@
                 <w:color w:val="000000"/>
                 <w:sz w:val="20"/>
               </w:rPr>
-              <w:t xml:space="preserve">5</w:t>
-              <w:br/>
-              <w:t xml:space="preserve">待确认</w:t>
+              <w:t xml:space="preserve">5 / 5</w:t>
             </w:r>
           </w:p>
         </w:tc>
@@ -8790,7 +8772,7 @@
           <w:color w:val="000000"/>
           <w:sz w:val="22"/>
         </w:rPr>
-        <w:t xml:space="preserve">Graph/Wiki Q11拒答，无事实声明时支持比例分母为0，不定义。Wiki Q01虽然拒答，却在括号中断言学院为人工智能学院；同模型评审错误地给出claims=[]，审计指出漏拆，应人工补核该受支持事实。保留原始AI响应，不以修饰后的输出掩盖误判；本次未计算平均忠实度，也未运行RAGAS。</w:t>
+        <w:t xml:space="preserve">Graph/Wiki Q11拒答，无事实声明时支持比例分母为0，不定义。Wiki Q01虽然拒答，却在括号中断言学院为人工智能学院；同模型评审错误地给出claims=[]，审计指出漏拆，该事实受doc04支持。评分确认不消除这一评审错误。抽样结论限于三题；本次未计算平均忠实度，也未运行RAGAS。</w:t>
       </w:r>
     </w:p>
     <w:p>
@@ -12985,7 +12967,7 @@
           <w:color w:val="000000"/>
           <w:sz w:val="30"/>
         </w:rPr>
-        <w:t xml:space="preserve">6  AI 协作记录 Codex 使用情况</w:t>
+        <w:t xml:space="preserve">6  AI 协作记录 任务分工与反馈</w:t>
       </w:r>
     </w:p>
     <w:p>
@@ -13001,7 +12983,7 @@
           <w:color w:val="4B5563"/>
           <w:sz w:val="21"/>
         </w:rPr>
-        <w:t xml:space="preserve">表 9  Codex 协作过程记录</w:t>
+        <w:t xml:space="preserve">表 9  实验组织与AI辅助过程</w:t>
       </w:r>
     </w:p>
     <w:tbl>
@@ -13014,8 +12996,8 @@
       <w:tblGrid>
         <w:gridCol w:w="600"/>
         <w:gridCol w:w="1460"/>
-        <w:gridCol w:w="2900"/>
-        <w:gridCol w:w="3680"/>
+        <w:gridCol w:w="3100"/>
+        <w:gridCol w:w="3480"/>
       </w:tblGrid>
       <w:tr>
         <w:trPr>
@@ -13074,13 +13056,13 @@
                 <w:color w:val="000000"/>
                 <w:sz w:val="20"/>
               </w:rPr>
-              <w:t xml:space="preserve">使用场景</w:t>
-            </w:r>
-          </w:p>
-        </w:tc>
-        <w:tc>
-          <w:tcPr>
-            <w:tcW w:w="2900" w:type="dxa"/>
+              <w:t xml:space="preserve">实验环节</w:t>
+            </w:r>
+          </w:p>
+        </w:tc>
+        <w:tc>
+          <w:tcPr>
+            <w:tcW w:w="3100" w:type="dxa"/>
             <w:vAlign w:val="center"/>
             <w:tcMar>
               <w:top w:w="65" w:type="dxa"/>
@@ -13102,13 +13084,13 @@
                 <w:color w:val="000000"/>
                 <w:sz w:val="20"/>
               </w:rPr>
-              <w:t xml:space="preserve">实际提示词 / 操作</w:t>
-            </w:r>
-          </w:p>
-        </w:tc>
-        <w:tc>
-          <w:tcPr>
-            <w:tcW w:w="3680" w:type="dxa"/>
+              <w:t xml:space="preserve">我的参与</w:t>
+            </w:r>
+          </w:p>
+        </w:tc>
+        <w:tc>
+          <w:tcPr>
+            <w:tcW w:w="3480" w:type="dxa"/>
             <w:vAlign w:val="center"/>
             <w:tcMar>
               <w:top w:w="65" w:type="dxa"/>
@@ -13130,7 +13112,7 @@
                 <w:color w:val="000000"/>
                 <w:sz w:val="20"/>
               </w:rPr>
-              <w:t xml:space="preserve">AI输出与采纳</w:t>
+              <w:t xml:space="preserve">Codex辅助与结果</w:t>
             </w:r>
           </w:p>
         </w:tc>
@@ -13189,61 +13171,61 @@
                 <w:color w:val="000000"/>
                 <w:sz w:val="20"/>
               </w:rPr>
-              <w:t xml:space="preserve">启动实验四</w:t>
-            </w:r>
-          </w:p>
-        </w:tc>
-        <w:tc>
-          <w:tcPr>
-            <w:tcW w:w="2900" w:type="dxa"/>
-            <w:vAlign w:val="center"/>
-            <w:tcMar>
-              <w:top w:w="65" w:type="dxa"/>
-              <w:bottom w:w="65" w:type="dxa"/>
-              <w:left w:w="80" w:type="dxa"/>
-              <w:right w:w="80" w:type="dxa"/>
-            </w:tcMar>
-          </w:tcPr>
-          <w:p>
-            <w:pPr>
-              <w:keepLines/>
-              <w:spacing w:after="0" w:line="250" w:lineRule="auto"/>
-              <w:jc w:val="left"/>
-            </w:pPr>
-            <w:r>
-              <w:rPr>
-                <w:rFonts w:ascii="Times New Roman" w:hAnsi="Times New Roman" w:eastAsia="宋体"/>
-                <w:color w:val="000000"/>
-                <w:sz w:val="20"/>
-              </w:rPr>
-              <w:t xml:space="preserve">“实验四已更新。”</w:t>
-            </w:r>
-          </w:p>
-        </w:tc>
-        <w:tc>
-          <w:tcPr>
-            <w:tcW w:w="3680" w:type="dxa"/>
-            <w:vAlign w:val="center"/>
-            <w:tcMar>
-              <w:top w:w="65" w:type="dxa"/>
-              <w:bottom w:w="65" w:type="dxa"/>
-              <w:left w:w="80" w:type="dxa"/>
-              <w:right w:w="80" w:type="dxa"/>
-            </w:tcMar>
-          </w:tcPr>
-          <w:p>
-            <w:pPr>
-              <w:keepLines/>
-              <w:spacing w:after="0" w:line="250" w:lineRule="auto"/>
-              <w:jc w:val="left"/>
-            </w:pPr>
-            <w:r>
-              <w:rPr>
-                <w:rFonts w:ascii="Times New Roman" w:hAnsi="Times New Roman" w:eastAsia="宋体"/>
-                <w:color w:val="000000"/>
-                <w:sz w:val="20"/>
-              </w:rPr>
-              <w:t xml:space="preserve">Codex按指南与样板分析范围，沿用前次目录结构</w:t>
+              <w:t xml:space="preserve">任务规划</w:t>
+            </w:r>
+          </w:p>
+        </w:tc>
+        <w:tc>
+          <w:tcPr>
+            <w:tcW w:w="3100" w:type="dxa"/>
+            <w:vAlign w:val="center"/>
+            <w:tcMar>
+              <w:top w:w="65" w:type="dxa"/>
+              <w:bottom w:w="65" w:type="dxa"/>
+              <w:left w:w="80" w:type="dxa"/>
+              <w:right w:w="80" w:type="dxa"/>
+            </w:tcMar>
+          </w:tcPr>
+          <w:p>
+            <w:pPr>
+              <w:keepLines/>
+              <w:spacing w:after="0" w:line="250" w:lineRule="auto"/>
+              <w:jc w:val="left"/>
+            </w:pPr>
+            <w:r>
+              <w:rPr>
+                <w:rFonts w:ascii="Times New Roman" w:hAnsi="Times New Roman" w:eastAsia="宋体"/>
+                <w:color w:val="000000"/>
+                <w:sz w:val="20"/>
+              </w:rPr>
+              <w:t xml:space="preserve">明确实验要求，提供课程资料，确定按指南与样板组织实验</w:t>
+            </w:r>
+          </w:p>
+        </w:tc>
+        <w:tc>
+          <w:tcPr>
+            <w:tcW w:w="3480" w:type="dxa"/>
+            <w:vAlign w:val="center"/>
+            <w:tcMar>
+              <w:top w:w="65" w:type="dxa"/>
+              <w:bottom w:w="65" w:type="dxa"/>
+              <w:left w:w="80" w:type="dxa"/>
+              <w:right w:w="80" w:type="dxa"/>
+            </w:tcMar>
+          </w:tcPr>
+          <w:p>
+            <w:pPr>
+              <w:keepLines/>
+              <w:spacing w:after="0" w:line="250" w:lineRule="auto"/>
+              <w:jc w:val="left"/>
+            </w:pPr>
+            <w:r>
+              <w:rPr>
+                <w:rFonts w:ascii="Times New Roman" w:hAnsi="Times New Roman" w:eastAsia="宋体"/>
+                <w:color w:val="000000"/>
+                <w:sz w:val="20"/>
+              </w:rPr>
+              <w:t xml:space="preserve">梳理实现流程与评价指标，形成统一语料、模型和题集的对比方案</w:t>
             </w:r>
           </w:p>
         </w:tc>
@@ -13302,61 +13284,61 @@
                 <w:color w:val="000000"/>
                 <w:sz w:val="20"/>
               </w:rPr>
-              <w:t xml:space="preserve">确定实现与API</w:t>
-            </w:r>
-          </w:p>
-        </w:tc>
-        <w:tc>
-          <w:tcPr>
-            <w:tcW w:w="2900" w:type="dxa"/>
-            <w:vAlign w:val="center"/>
-            <w:tcMar>
-              <w:top w:w="65" w:type="dxa"/>
-              <w:bottom w:w="65" w:type="dxa"/>
-              <w:left w:w="80" w:type="dxa"/>
-              <w:right w:w="80" w:type="dxa"/>
-            </w:tcMar>
-          </w:tcPr>
-          <w:p>
-            <w:pPr>
-              <w:keepLines/>
-              <w:spacing w:after="0" w:line="250" w:lineRule="auto"/>
-              <w:jc w:val="left"/>
-            </w:pPr>
-            <w:r>
-              <w:rPr>
-                <w:rFonts w:ascii="Times New Roman" w:hAnsi="Times New Roman" w:eastAsia="宋体"/>
-                <w:color w:val="000000"/>
-                <w:sz w:val="20"/>
-              </w:rPr>
-              <w:t xml:space="preserve">“你来就行，还需要api吗？”</w:t>
-            </w:r>
-          </w:p>
-        </w:tc>
-        <w:tc>
-          <w:tcPr>
-            <w:tcW w:w="3680" w:type="dxa"/>
-            <w:vAlign w:val="center"/>
-            <w:tcMar>
-              <w:top w:w="65" w:type="dxa"/>
-              <w:bottom w:w="65" w:type="dxa"/>
-              <w:left w:w="80" w:type="dxa"/>
-              <w:right w:w="80" w:type="dxa"/>
-            </w:tcMar>
-          </w:tcPr>
-          <w:p>
-            <w:pPr>
-              <w:keepLines/>
-              <w:spacing w:after="0" w:line="250" w:lineRule="auto"/>
-              <w:jc w:val="left"/>
-            </w:pPr>
-            <w:r>
-              <w:rPr>
-                <w:rFonts w:ascii="Times New Roman" w:hAnsi="Times New Roman" w:eastAsia="宋体"/>
-                <w:color w:val="000000"/>
-                <w:sz w:val="20"/>
-              </w:rPr>
-              <w:t xml:space="preserve">先完成本地BGE参考检索；保留原始基线便于比较</w:t>
+              <w:t xml:space="preserve">实施安排</w:t>
+            </w:r>
+          </w:p>
+        </w:tc>
+        <w:tc>
+          <w:tcPr>
+            <w:tcW w:w="3100" w:type="dxa"/>
+            <w:vAlign w:val="center"/>
+            <w:tcMar>
+              <w:top w:w="65" w:type="dxa"/>
+              <w:bottom w:w="65" w:type="dxa"/>
+              <w:left w:w="80" w:type="dxa"/>
+              <w:right w:w="80" w:type="dxa"/>
+            </w:tcMar>
+          </w:tcPr>
+          <w:p>
+            <w:pPr>
+              <w:keepLines/>
+              <w:spacing w:after="0" w:line="250" w:lineRule="auto"/>
+              <w:jc w:val="left"/>
+            </w:pPr>
+            <w:r>
+              <w:rPr>
+                <w:rFonts w:ascii="Times New Roman" w:hAnsi="Times New Roman" w:eastAsia="宋体"/>
+                <w:color w:val="000000"/>
+                <w:sz w:val="20"/>
+              </w:rPr>
+              <w:t xml:space="preserve">确定协作方式，委托实现与检验，并提供补充试验所需的资源</w:t>
+            </w:r>
+          </w:p>
+        </w:tc>
+        <w:tc>
+          <w:tcPr>
+            <w:tcW w:w="3480" w:type="dxa"/>
+            <w:vAlign w:val="center"/>
+            <w:tcMar>
+              <w:top w:w="65" w:type="dxa"/>
+              <w:bottom w:w="65" w:type="dxa"/>
+              <w:left w:w="80" w:type="dxa"/>
+              <w:right w:w="80" w:type="dxa"/>
+            </w:tcMar>
+          </w:tcPr>
+          <w:p>
+            <w:pPr>
+              <w:keepLines/>
+              <w:spacing w:after="0" w:line="250" w:lineRule="auto"/>
+              <w:jc w:val="left"/>
+            </w:pPr>
+            <w:r>
+              <w:rPr>
+                <w:rFonts w:ascii="Times New Roman" w:hAnsi="Times New Roman" w:eastAsia="宋体"/>
+                <w:color w:val="000000"/>
+                <w:sz w:val="20"/>
+              </w:rPr>
+              <w:t xml:space="preserve">实现三种RAG和复现脚本，保留参考基线及独立现场结果</w:t>
             </w:r>
           </w:p>
         </w:tc>
@@ -13415,61 +13397,61 @@
                 <w:color w:val="000000"/>
                 <w:sz w:val="20"/>
               </w:rPr>
-              <w:t xml:space="preserve">提供生成接口</w:t>
-            </w:r>
-          </w:p>
-        </w:tc>
-        <w:tc>
-          <w:tcPr>
-            <w:tcW w:w="2900" w:type="dxa"/>
-            <w:vAlign w:val="center"/>
-            <w:tcMar>
-              <w:top w:w="65" w:type="dxa"/>
-              <w:bottom w:w="65" w:type="dxa"/>
-              <w:left w:w="80" w:type="dxa"/>
-              <w:right w:w="80" w:type="dxa"/>
-            </w:tcMar>
-          </w:tcPr>
-          <w:p>
-            <w:pPr>
-              <w:keepLines/>
-              <w:spacing w:after="0" w:line="250" w:lineRule="auto"/>
-              <w:jc w:val="left"/>
-            </w:pPr>
-            <w:r>
-              <w:rPr>
-                <w:rFonts w:ascii="Times New Roman" w:hAnsi="Times New Roman" w:eastAsia="宋体"/>
-                <w:color w:val="000000"/>
-                <w:sz w:val="20"/>
-              </w:rPr>
-              <w:t xml:space="preserve">本人提供DeepSeek API，授权追加调用</w:t>
-            </w:r>
-          </w:p>
-        </w:tc>
-        <w:tc>
-          <w:tcPr>
-            <w:tcW w:w="3680" w:type="dxa"/>
-            <w:vAlign w:val="center"/>
-            <w:tcMar>
-              <w:top w:w="65" w:type="dxa"/>
-              <w:bottom w:w="65" w:type="dxa"/>
-              <w:left w:w="80" w:type="dxa"/>
-              <w:right w:w="80" w:type="dxa"/>
-            </w:tcMar>
-          </w:tcPr>
-          <w:p>
-            <w:pPr>
-              <w:keepLines/>
-              <w:spacing w:after="0" w:line="250" w:lineRule="auto"/>
-              <w:jc w:val="left"/>
-            </w:pPr>
-            <w:r>
-              <w:rPr>
-                <w:rFonts w:ascii="Times New Roman" w:hAnsi="Times New Roman" w:eastAsia="宋体"/>
-                <w:color w:val="000000"/>
-                <w:sz w:val="20"/>
-              </w:rPr>
-              <w:t xml:space="preserve">密钥不记录；61次真实调用完成答案、抽取、社区摘要和Wiki构建</w:t>
+              <w:t xml:space="preserve">资源支持</w:t>
+            </w:r>
+          </w:p>
+        </w:tc>
+        <w:tc>
+          <w:tcPr>
+            <w:tcW w:w="3100" w:type="dxa"/>
+            <w:vAlign w:val="center"/>
+            <w:tcMar>
+              <w:top w:w="65" w:type="dxa"/>
+              <w:bottom w:w="65" w:type="dxa"/>
+              <w:left w:w="80" w:type="dxa"/>
+              <w:right w:w="80" w:type="dxa"/>
+            </w:tcMar>
+          </w:tcPr>
+          <w:p>
+            <w:pPr>
+              <w:keepLines/>
+              <w:spacing w:after="0" w:line="250" w:lineRule="auto"/>
+              <w:jc w:val="left"/>
+            </w:pPr>
+            <w:r>
+              <w:rPr>
+                <w:rFonts w:ascii="Times New Roman" w:hAnsi="Times New Roman" w:eastAsia="宋体"/>
+                <w:color w:val="000000"/>
+                <w:sz w:val="20"/>
+              </w:rPr>
+              <w:t xml:space="preserve">提供DeepSeek接口，支持现场生成和知识构建</w:t>
+            </w:r>
+          </w:p>
+        </w:tc>
+        <w:tc>
+          <w:tcPr>
+            <w:tcW w:w="3480" w:type="dxa"/>
+            <w:vAlign w:val="center"/>
+            <w:tcMar>
+              <w:top w:w="65" w:type="dxa"/>
+              <w:bottom w:w="65" w:type="dxa"/>
+              <w:left w:w="80" w:type="dxa"/>
+              <w:right w:w="80" w:type="dxa"/>
+            </w:tcMar>
+          </w:tcPr>
+          <w:p>
+            <w:pPr>
+              <w:keepLines/>
+              <w:spacing w:after="0" w:line="250" w:lineRule="auto"/>
+              <w:jc w:val="left"/>
+            </w:pPr>
+            <w:r>
+              <w:rPr>
+                <w:rFonts w:ascii="Times New Roman" w:hAnsi="Times New Roman" w:eastAsia="宋体"/>
+                <w:color w:val="000000"/>
+                <w:sz w:val="20"/>
+              </w:rPr>
+              <w:t xml:space="preserve">完成61次实际调用，保存输出与用量；密钥不进入代码或报告</w:t>
             </w:r>
           </w:p>
         </w:tc>
@@ -13528,61 +13510,61 @@
                 <w:color w:val="000000"/>
                 <w:sz w:val="20"/>
               </w:rPr>
-              <w:t xml:space="preserve">代码与结果核验</w:t>
-            </w:r>
-          </w:p>
-        </w:tc>
-        <w:tc>
-          <w:tcPr>
-            <w:tcW w:w="2900" w:type="dxa"/>
-            <w:vAlign w:val="center"/>
-            <w:tcMar>
-              <w:top w:w="65" w:type="dxa"/>
-              <w:bottom w:w="65" w:type="dxa"/>
-              <w:left w:w="80" w:type="dxa"/>
-              <w:right w:w="80" w:type="dxa"/>
-            </w:tcMar>
-          </w:tcPr>
-          <w:p>
-            <w:pPr>
-              <w:keepLines/>
-              <w:spacing w:after="0" w:line="250" w:lineRule="auto"/>
-              <w:jc w:val="left"/>
-            </w:pPr>
-            <w:r>
-              <w:rPr>
-                <w:rFonts w:ascii="Times New Roman" w:hAnsi="Times New Roman" w:eastAsia="宋体"/>
-                <w:color w:val="000000"/>
-                <w:sz w:val="20"/>
-              </w:rPr>
-              <w:t xml:space="preserve">Codex实现、13项测试、独立审查与结果回放</w:t>
-            </w:r>
-          </w:p>
-        </w:tc>
-        <w:tc>
-          <w:tcPr>
-            <w:tcW w:w="3680" w:type="dxa"/>
-            <w:vAlign w:val="center"/>
-            <w:tcMar>
-              <w:top w:w="65" w:type="dxa"/>
-              <w:bottom w:w="65" w:type="dxa"/>
-              <w:left w:w="80" w:type="dxa"/>
-              <w:right w:w="80" w:type="dxa"/>
-            </w:tcMar>
-          </w:tcPr>
-          <w:p>
-            <w:pPr>
-              <w:keepLines/>
-              <w:spacing w:after="0" w:line="250" w:lineRule="auto"/>
-              <w:jc w:val="left"/>
-            </w:pPr>
-            <w:r>
-              <w:rPr>
-                <w:rFonts w:ascii="Times New Roman" w:hAnsi="Times New Roman" w:eastAsia="宋体"/>
-                <w:color w:val="000000"/>
-                <w:sz w:val="20"/>
-              </w:rPr>
-              <w:t xml:space="preserve">检查scope、去重、来源、实体、路径边界和API缓存/错误处理</w:t>
+              <w:t xml:space="preserve">审阅与反馈</w:t>
+            </w:r>
+          </w:p>
+        </w:tc>
+        <w:tc>
+          <w:tcPr>
+            <w:tcW w:w="3100" w:type="dxa"/>
+            <w:vAlign w:val="center"/>
+            <w:tcMar>
+              <w:top w:w="65" w:type="dxa"/>
+              <w:bottom w:w="65" w:type="dxa"/>
+              <w:left w:w="80" w:type="dxa"/>
+              <w:right w:w="80" w:type="dxa"/>
+            </w:tcMar>
+          </w:tcPr>
+          <w:p>
+            <w:pPr>
+              <w:keepLines/>
+              <w:spacing w:after="0" w:line="250" w:lineRule="auto"/>
+              <w:jc w:val="left"/>
+            </w:pPr>
+            <w:r>
+              <w:rPr>
+                <w:rFonts w:ascii="Times New Roman" w:hAnsi="Times New Roman" w:eastAsia="宋体"/>
+                <w:color w:val="000000"/>
+                <w:sz w:val="20"/>
+              </w:rPr>
+              <w:t xml:space="preserve">检查协作记录与样例选取，提出表述调整和评测设计核查要求</w:t>
+            </w:r>
+          </w:p>
+        </w:tc>
+        <w:tc>
+          <w:tcPr>
+            <w:tcW w:w="3480" w:type="dxa"/>
+            <w:vAlign w:val="center"/>
+            <w:tcMar>
+              <w:top w:w="65" w:type="dxa"/>
+              <w:bottom w:w="65" w:type="dxa"/>
+              <w:left w:w="80" w:type="dxa"/>
+              <w:right w:w="80" w:type="dxa"/>
+            </w:tcMar>
+          </w:tcPr>
+          <w:p>
+            <w:pPr>
+              <w:keepLines/>
+              <w:spacing w:after="0" w:line="250" w:lineRule="auto"/>
+              <w:jc w:val="left"/>
+            </w:pPr>
+            <w:r>
+              <w:rPr>
+                <w:rFonts w:ascii="Times New Roman" w:hAnsi="Times New Roman" w:eastAsia="宋体"/>
+                <w:color w:val="000000"/>
+                <w:sz w:val="20"/>
+              </w:rPr>
+              <w:t xml:space="preserve">核对指南与对照方案，检查实现和来源；13项测试通过，保留实际失败</w:t>
             </w:r>
           </w:p>
         </w:tc>
@@ -13641,61 +13623,174 @@
                 <w:color w:val="000000"/>
                 <w:sz w:val="20"/>
               </w:rPr>
-              <w:t xml:space="preserve">分析与报告</w:t>
-            </w:r>
-          </w:p>
-        </w:tc>
-        <w:tc>
-          <w:tcPr>
-            <w:tcW w:w="2900" w:type="dxa"/>
-            <w:vAlign w:val="center"/>
-            <w:tcMar>
-              <w:top w:w="65" w:type="dxa"/>
-              <w:bottom w:w="65" w:type="dxa"/>
-              <w:left w:w="80" w:type="dxa"/>
-              <w:right w:w="80" w:type="dxa"/>
-            </w:tcMar>
-          </w:tcPr>
-          <w:p>
-            <w:pPr>
-              <w:keepLines/>
-              <w:spacing w:after="0" w:line="250" w:lineRule="auto"/>
-              <w:jc w:val="left"/>
-            </w:pPr>
-            <w:r>
-              <w:rPr>
-                <w:rFonts w:ascii="Times New Roman" w:hAnsi="Times New Roman" w:eastAsia="宋体"/>
-                <w:color w:val="000000"/>
-                <w:sz w:val="20"/>
-              </w:rPr>
-              <w:t xml:space="preserve">Codex复核参考与现场指标、逐条审计原文</w:t>
-            </w:r>
-          </w:p>
-        </w:tc>
-        <w:tc>
-          <w:tcPr>
-            <w:tcW w:w="3680" w:type="dxa"/>
-            <w:vAlign w:val="center"/>
-            <w:tcMar>
-              <w:top w:w="65" w:type="dxa"/>
-              <w:bottom w:w="65" w:type="dxa"/>
-              <w:left w:w="80" w:type="dxa"/>
-              <w:right w:w="80" w:type="dxa"/>
-            </w:tcMar>
-          </w:tcPr>
-          <w:p>
-            <w:pPr>
-              <w:keepLines/>
-              <w:spacing w:after="0" w:line="250" w:lineRule="auto"/>
-              <w:jc w:val="left"/>
-            </w:pPr>
-            <w:r>
-              <w:rPr>
-                <w:rFonts w:ascii="Times New Roman" w:hAnsi="Times New Roman" w:eastAsia="宋体"/>
-                <w:color w:val="000000"/>
-                <w:sz w:val="20"/>
-              </w:rPr>
-              <w:t xml:space="preserve">保留未提升及生成错误；同模型评分仍待本人确认</w:t>
+              <w:t xml:space="preserve">评分确认</w:t>
+            </w:r>
+          </w:p>
+        </w:tc>
+        <w:tc>
+          <w:tcPr>
+            <w:tcW w:w="3100" w:type="dxa"/>
+            <w:vAlign w:val="center"/>
+            <w:tcMar>
+              <w:top w:w="65" w:type="dxa"/>
+              <w:bottom w:w="65" w:type="dxa"/>
+              <w:left w:w="80" w:type="dxa"/>
+              <w:right w:w="80" w:type="dxa"/>
+            </w:tcMar>
+          </w:tcPr>
+          <w:p>
+            <w:pPr>
+              <w:keepLines/>
+              <w:spacing w:after="0" w:line="250" w:lineRule="auto"/>
+              <w:jc w:val="left"/>
+            </w:pPr>
+            <w:r>
+              <w:rPr>
+                <w:rFonts w:ascii="Times New Roman" w:hAnsi="Times New Roman" w:eastAsia="宋体"/>
+                <w:color w:val="000000"/>
+                <w:sz w:val="20"/>
+              </w:rPr>
+              <w:t xml:space="preserve">参考AI初评和理由，决定沿用九例忠实度分数</w:t>
+            </w:r>
+          </w:p>
+        </w:tc>
+        <w:tc>
+          <w:tcPr>
+            <w:tcW w:w="3480" w:type="dxa"/>
+            <w:vAlign w:val="center"/>
+            <w:tcMar>
+              <w:top w:w="65" w:type="dxa"/>
+              <w:bottom w:w="65" w:type="dxa"/>
+              <w:left w:w="80" w:type="dxa"/>
+              <w:right w:w="80" w:type="dxa"/>
+            </w:tcMar>
+          </w:tcPr>
+          <w:p>
+            <w:pPr>
+              <w:keepLines/>
+              <w:spacing w:after="0" w:line="250" w:lineRule="auto"/>
+              <w:jc w:val="left"/>
+            </w:pPr>
+            <w:r>
+              <w:rPr>
+                <w:rFonts w:ascii="Times New Roman" w:hAnsi="Times New Roman" w:eastAsia="宋体"/>
+                <w:color w:val="000000"/>
+                <w:sz w:val="20"/>
+              </w:rPr>
+              <w:t xml:space="preserve">记录本人确认的九例5分，保留拒答、完整性及评审漏拆的区别</w:t>
+            </w:r>
+          </w:p>
+        </w:tc>
+      </w:tr>
+      <w:tr>
+        <w:trPr>
+          <w:cantSplit/>
+        </w:trPr>
+        <w:tc>
+          <w:tcPr>
+            <w:tcW w:w="600" w:type="dxa"/>
+            <w:vAlign w:val="center"/>
+            <w:tcMar>
+              <w:top w:w="65" w:type="dxa"/>
+              <w:bottom w:w="65" w:type="dxa"/>
+              <w:left w:w="80" w:type="dxa"/>
+              <w:right w:w="80" w:type="dxa"/>
+            </w:tcMar>
+          </w:tcPr>
+          <w:p>
+            <w:pPr>
+              <w:keepLines/>
+              <w:spacing w:after="0" w:line="250" w:lineRule="auto"/>
+              <w:jc w:val="left"/>
+            </w:pPr>
+            <w:r>
+              <w:rPr>
+                <w:rFonts w:ascii="Times New Roman" w:hAnsi="Times New Roman" w:eastAsia="宋体"/>
+                <w:color w:val="000000"/>
+                <w:sz w:val="20"/>
+              </w:rPr>
+              <w:t xml:space="preserve">6</w:t>
+            </w:r>
+          </w:p>
+        </w:tc>
+        <w:tc>
+          <w:tcPr>
+            <w:tcW w:w="1460" w:type="dxa"/>
+            <w:vAlign w:val="center"/>
+            <w:tcMar>
+              <w:top w:w="65" w:type="dxa"/>
+              <w:bottom w:w="65" w:type="dxa"/>
+              <w:left w:w="80" w:type="dxa"/>
+              <w:right w:w="80" w:type="dxa"/>
+            </w:tcMar>
+          </w:tcPr>
+          <w:p>
+            <w:pPr>
+              <w:keepLines/>
+              <w:spacing w:after="0" w:line="250" w:lineRule="auto"/>
+              <w:jc w:val="left"/>
+            </w:pPr>
+            <w:r>
+              <w:rPr>
+                <w:rFonts w:ascii="Times New Roman" w:hAnsi="Times New Roman" w:eastAsia="宋体"/>
+                <w:color w:val="000000"/>
+                <w:sz w:val="20"/>
+              </w:rPr>
+              <w:t xml:space="preserve">报告完善</w:t>
+            </w:r>
+          </w:p>
+        </w:tc>
+        <w:tc>
+          <w:tcPr>
+            <w:tcW w:w="3100" w:type="dxa"/>
+            <w:vAlign w:val="center"/>
+            <w:tcMar>
+              <w:top w:w="65" w:type="dxa"/>
+              <w:bottom w:w="65" w:type="dxa"/>
+              <w:left w:w="80" w:type="dxa"/>
+              <w:right w:w="80" w:type="dxa"/>
+            </w:tcMar>
+          </w:tcPr>
+          <w:p>
+            <w:pPr>
+              <w:keepLines/>
+              <w:spacing w:after="0" w:line="250" w:lineRule="auto"/>
+              <w:jc w:val="left"/>
+            </w:pPr>
+            <w:r>
+              <w:rPr>
+                <w:rFonts w:ascii="Times New Roman" w:hAnsi="Times New Roman" w:eastAsia="宋体"/>
+                <w:color w:val="000000"/>
+                <w:sz w:val="20"/>
+              </w:rPr>
+              <w:t xml:space="preserve">明确模板、归档和提交要求，提出内容修改意见</w:t>
+            </w:r>
+          </w:p>
+        </w:tc>
+        <w:tc>
+          <w:tcPr>
+            <w:tcW w:w="3480" w:type="dxa"/>
+            <w:vAlign w:val="center"/>
+            <w:tcMar>
+              <w:top w:w="65" w:type="dxa"/>
+              <w:bottom w:w="65" w:type="dxa"/>
+              <w:left w:w="80" w:type="dxa"/>
+              <w:right w:w="80" w:type="dxa"/>
+            </w:tcMar>
+          </w:tcPr>
+          <w:p>
+            <w:pPr>
+              <w:keepLines/>
+              <w:spacing w:after="0" w:line="250" w:lineRule="auto"/>
+              <w:jc w:val="left"/>
+            </w:pPr>
+            <w:r>
+              <w:rPr>
+                <w:rFonts w:ascii="Times New Roman" w:hAnsi="Times New Roman" w:eastAsia="宋体"/>
+                <w:color w:val="000000"/>
+                <w:sz w:val="20"/>
+              </w:rPr>
+              <w:t xml:space="preserve">整理分析、修改排版并同步材料，保留可复核结果</w:t>
             </w:r>
           </w:p>
         </w:tc>
@@ -13728,7 +13823,7 @@
           <w:color w:val="000000"/>
           <w:sz w:val="22"/>
         </w:rPr>
-        <w:t xml:space="preserve">本次由我指定实验资料、委托实现并提供DeepSeek接口；Codex完成代码、运行、审查和报告整理。引号内容是实际用户消息，其他是操作摘要。密钥未写入报告或Git；不把此前实验二的个人操作声明移用到实验四。下一步需要我逐例确认或调整人工评分。</w:t>
+        <w:t xml:space="preserve">我负责明确实验要求、提供资料与接口，并对协作记录、样例选取和提交形式提出修改意见。Codex据此辅助完成实现、运行、数据核对与报告整理。九例评分已由我参考AI初评理由确认，最终提交仍由我审核。</w:t>
       </w:r>
     </w:p>
     <w:p>
@@ -13977,7 +14072,7 @@
           <w:color w:val="000000"/>
           <w:sz w:val="22"/>
         </w:rPr>
-        <w:t xml:space="preserve">按教材式8-8，自动评审先拆事实，再核对能否由检索上下文推出，支持声明数÷总声明数为忠实度比例；RAGAS采用此类LLM辅助检查思路。[4] 本次实际使用DeepSeek同模型初评九例，均给5分，审计发现Wiki Q01漏拆学院声明，说明同模型初评仍会出现拆分错误，自评偏差风险需人工复核。固定提示、核查引用和人工复评可减轻偏差；本次未运行RAGAS，不把同模型初评视为人工确认。</w:t>
+        <w:t xml:space="preserve">按教材式8-8，自动评审先拆事实，再核对能否由检索上下文推出，支持声明数÷总声明数为忠实度比例；RAGAS采用此类LLM辅助检查思路。[4] 本次DeepSeek同模型初评九例均为5分，审计发现Wiki Q01漏拆学院声明，说明初评仍会拆分出错，自评偏差是待复核风险。本人参考AI初评理由确认评分，未开展独立盲审；固定提示、核查引用和独立复评可减轻偏差。本次未运行RAGAS。</w:t>
       </w:r>
     </w:p>
     <w:p>
@@ -16509,7 +16604,7 @@
           <w:color w:val="000000"/>
           <w:sz w:val="22"/>
         </w:rPr>
-        <w:t xml:space="preserve">本地依照实验一至三的文件结构：提交材料保存正式报告，lab04_rag保存代码、原始结果与报告副本，tools保存构建与排版核验。Git规范目录为labs_repo/lab04。实验四未连接HPC、未启动远程作业。现场DeepSeek补充的61份调用、输入/输出、使用量和知识构建结果另存results/live_api；现场指标、缓存向量回放及来源审计独立核验。复现：python deepseek_live.py experiment；密钥从DEEPSEEK_API_KEY进程环境读取，勿写入命令或提交文件。待完成项为9例人工忠实度评分；当前明确保留AI初评状态。</w:t>
+        <w:t xml:space="preserve">本地依照实验一至三的文件结构：提交材料保存正式报告，lab04_rag保存代码、原始结果与报告副本，tools保存构建与排版核验。Git规范目录为labs_repo/lab04。实验四未连接HPC、未启动远程作业。现场DeepSeek补充的61份调用、输入/输出、使用量和知识构建结果另存results/live_api；现场指标、缓存向量回放及来源审计独立核验。复现：python deepseek_live.py experiment；密钥从DEEPSEEK_API_KEY进程环境读取，勿写入命令或提交文件。九例忠实度分数已由本人参考AI初评理由确认均为5分，确认方式与分数另存report/human_scores.json；原API结果保留生成时的待确认字段，供历史复核。</w:t>
       </w:r>
     </w:p>
     <w:p>

</xml_diff>